<commit_message>
Reviewed and made final changes to project proposal document and AI declaration document
Reviewed and made final changes to project proposal document and AI declaration document
</commit_message>
<xml_diff>
--- a/docs/sba26094_CA1_AI_Declaration_v1.docx
+++ b/docs/sba26094_CA1_AI_Declaration_v1.docx
@@ -41,7 +41,7 @@
                     </pic:cNvPicPr>
                   </pic:nvPicPr>
                   <pic:blipFill>
-                    <a:blip r:embed="rId5">
+                    <a:blip r:embed="rId7">
                       <a:extLst>
                         <a:ext uri="{28A0092B-C50C-407E-A947-70E740481C1C}">
                           <a14:useLocalDpi xmlns:a14="http://schemas.microsoft.com/office/drawing/2010/main" val="0"/>
@@ -432,7 +432,16 @@
                 <w:sz w:val="32"/>
                 <w:szCs w:val="32"/>
               </w:rPr>
-              <w:t>Sba26094</w:t>
+              <w:t>s</w:t>
+            </w:r>
+            <w:r>
+              <w:rPr>
+                <w:i/>
+                <w:color w:val="156082"/>
+                <w:sz w:val="32"/>
+                <w:szCs w:val="32"/>
+              </w:rPr>
+              <w:t>ba26094</w:t>
             </w:r>
           </w:p>
         </w:tc>
@@ -650,7 +659,6 @@
                 <w:szCs w:val="32"/>
               </w:rPr>
             </w:pPr>
-            <w:proofErr w:type="spellStart"/>
             <w:r>
               <w:rPr>
                 <w:i/>
@@ -658,17 +666,7 @@
                 <w:sz w:val="32"/>
                 <w:szCs w:val="32"/>
               </w:rPr>
-              <w:t>Taufique</w:t>
-            </w:r>
-            <w:proofErr w:type="spellEnd"/>
-            <w:r>
-              <w:rPr>
-                <w:i/>
-                <w:color w:val="156082"/>
-                <w:sz w:val="32"/>
-                <w:szCs w:val="32"/>
-              </w:rPr>
-              <w:t xml:space="preserve"> Ahmed</w:t>
+              <w:t>Taufique Ahmed</w:t>
             </w:r>
           </w:p>
         </w:tc>
@@ -783,7 +781,16 @@
                 <w:sz w:val="32"/>
                 <w:szCs w:val="32"/>
               </w:rPr>
-              <w:t>__/10/2026</w:t>
+              <w:t>24</w:t>
+            </w:r>
+            <w:r>
+              <w:rPr>
+                <w:i/>
+                <w:color w:val="156082"/>
+                <w:sz w:val="32"/>
+                <w:szCs w:val="32"/>
+              </w:rPr>
+              <w:t>/10/2026</w:t>
             </w:r>
           </w:p>
         </w:tc>
@@ -828,7 +835,7 @@
                 <w:szCs w:val="32"/>
               </w:rPr>
             </w:pPr>
-            <w:hyperlink r:id="rId6" w:history="1">
+            <w:hyperlink r:id="rId8" w:history="1">
               <w:r>
                 <w:rPr>
                   <w:rStyle w:val="Hyperlink"/>
@@ -1121,622 +1128,18 @@
     </w:p>
     <w:p>
       <w:pPr>
-        <w:rPr>
-          <w:rFonts w:ascii="Aptos" w:eastAsia="Aptos" w:hAnsi="Aptos" w:cs="Aptos"/>
-          <w:b/>
-          <w:color w:val="FF0000"/>
-          <w:sz w:val="30"/>
-          <w:szCs w:val="30"/>
-          <w:u w:val="single"/>
-        </w:rPr>
+        <w:pStyle w:val="Heading1"/>
       </w:pPr>
       <w:r>
-        <w:rPr>
-          <w:rFonts w:ascii="Aptos" w:eastAsia="Aptos" w:hAnsi="Aptos" w:cs="Aptos"/>
-          <w:b/>
-          <w:color w:val="FF0000"/>
-          <w:sz w:val="30"/>
-          <w:szCs w:val="30"/>
-          <w:u w:val="single"/>
-        </w:rPr>
         <w:lastRenderedPageBreak/>
-        <w:t>Please read all the instructions on this document carefully!!!</w:t>
+        <w:t>Appendix: AI Use Declaration &amp; Prompt Record</w:t>
       </w:r>
     </w:p>
     <w:p>
       <w:pPr>
         <w:rPr>
-          <w:rFonts w:ascii="Aptos" w:eastAsia="Aptos" w:hAnsi="Aptos" w:cs="Aptos"/>
-          <w:color w:val="FF0000"/>
-          <w:sz w:val="24"/>
-          <w:szCs w:val="24"/>
-        </w:rPr>
-      </w:pPr>
-    </w:p>
-    <w:p>
-      <w:pPr>
-        <w:rPr>
-          <w:rFonts w:ascii="Aptos" w:eastAsia="Aptos" w:hAnsi="Aptos" w:cs="Aptos"/>
-          <w:b/>
-          <w:color w:val="FF0000"/>
-          <w:sz w:val="24"/>
-          <w:szCs w:val="24"/>
-        </w:rPr>
-      </w:pPr>
-      <w:r>
-        <w:rPr>
-          <w:rFonts w:ascii="Aptos" w:eastAsia="Aptos" w:hAnsi="Aptos" w:cs="Aptos"/>
-          <w:b/>
-          <w:color w:val="FF0000"/>
-          <w:sz w:val="24"/>
-          <w:szCs w:val="24"/>
-        </w:rPr>
-        <w:t>Filling out the cover sheet</w:t>
-      </w:r>
-    </w:p>
-    <w:p>
-      <w:pPr>
-        <w:rPr>
-          <w:rFonts w:ascii="Aptos" w:eastAsia="Aptos" w:hAnsi="Aptos" w:cs="Aptos"/>
-          <w:b/>
-          <w:color w:val="FF0000"/>
-          <w:sz w:val="24"/>
-          <w:szCs w:val="24"/>
-        </w:rPr>
-      </w:pPr>
-    </w:p>
-    <w:p>
-      <w:pPr>
-        <w:rPr>
-          <w:rFonts w:ascii="Aptos" w:eastAsia="Aptos" w:hAnsi="Aptos" w:cs="Aptos"/>
-          <w:color w:val="FF0000"/>
-          <w:sz w:val="24"/>
-          <w:szCs w:val="24"/>
-        </w:rPr>
-      </w:pPr>
-      <w:r>
-        <w:rPr>
-          <w:rFonts w:ascii="Aptos" w:eastAsia="Aptos" w:hAnsi="Aptos" w:cs="Aptos"/>
-          <w:color w:val="FF0000"/>
-          <w:sz w:val="24"/>
-          <w:szCs w:val="24"/>
-        </w:rPr>
-        <w:t>Fill out the top section of the cover page with all the required information.</w:t>
-      </w:r>
-    </w:p>
-    <w:p>
-      <w:pPr>
-        <w:rPr>
-          <w:rFonts w:ascii="Aptos" w:eastAsia="Aptos" w:hAnsi="Aptos" w:cs="Aptos"/>
-          <w:color w:val="FF0000"/>
-          <w:sz w:val="24"/>
-          <w:szCs w:val="24"/>
-        </w:rPr>
-      </w:pPr>
-    </w:p>
-    <w:p>
-      <w:pPr>
-        <w:rPr>
-          <w:rFonts w:ascii="Aptos" w:eastAsia="Aptos" w:hAnsi="Aptos" w:cs="Aptos"/>
-          <w:color w:val="FF0000"/>
-          <w:sz w:val="24"/>
-          <w:szCs w:val="24"/>
-        </w:rPr>
-      </w:pPr>
-      <w:r>
-        <w:rPr>
-          <w:rFonts w:ascii="Aptos" w:eastAsia="Aptos" w:hAnsi="Aptos" w:cs="Aptos"/>
-          <w:color w:val="FF0000"/>
-          <w:sz w:val="24"/>
-          <w:szCs w:val="24"/>
-        </w:rPr>
-        <w:t>In the "Use of AI" section, choose the statement that accurately reflects your work:</w:t>
-      </w:r>
-    </w:p>
-    <w:p>
-      <w:pPr>
-        <w:rPr>
-          <w:rFonts w:ascii="Aptos" w:eastAsia="Aptos" w:hAnsi="Aptos" w:cs="Aptos"/>
-          <w:b/>
-          <w:color w:val="FF0000"/>
-          <w:sz w:val="24"/>
-          <w:szCs w:val="24"/>
-        </w:rPr>
-      </w:pPr>
-    </w:p>
-    <w:p>
-      <w:pPr>
-        <w:rPr>
-          <w:rFonts w:ascii="Aptos" w:eastAsia="Aptos" w:hAnsi="Aptos" w:cs="Aptos"/>
-          <w:color w:val="FF0000"/>
-          <w:sz w:val="24"/>
-          <w:szCs w:val="24"/>
-        </w:rPr>
-      </w:pPr>
-      <w:r>
-        <w:rPr>
-          <w:rFonts w:ascii="Aptos" w:eastAsia="Aptos" w:hAnsi="Aptos" w:cs="Aptos"/>
-          <w:b/>
-          <w:color w:val="FF0000"/>
-          <w:sz w:val="24"/>
-          <w:szCs w:val="24"/>
-        </w:rPr>
-        <w:t>If you utilized AI</w:t>
-      </w:r>
-      <w:r>
-        <w:rPr>
-          <w:rFonts w:ascii="Aptos" w:eastAsia="Aptos" w:hAnsi="Aptos" w:cs="Aptos"/>
-          <w:color w:val="FF0000"/>
-          <w:sz w:val="24"/>
-          <w:szCs w:val="24"/>
-        </w:rPr>
-        <w:t>: select the first statement. Provide details about the AI tool used and its application. Delete the second statement.</w:t>
-      </w:r>
-    </w:p>
-    <w:p>
-      <w:pPr>
-        <w:rPr>
-          <w:rFonts w:ascii="Aptos" w:eastAsia="Aptos" w:hAnsi="Aptos" w:cs="Aptos"/>
-          <w:color w:val="FF0000"/>
-          <w:sz w:val="24"/>
-          <w:szCs w:val="24"/>
-        </w:rPr>
-      </w:pPr>
-      <w:r>
-        <w:rPr>
-          <w:rFonts w:ascii="Aptos" w:eastAsia="Aptos" w:hAnsi="Aptos" w:cs="Aptos"/>
-          <w:color w:val="FF0000"/>
-          <w:sz w:val="24"/>
-          <w:szCs w:val="24"/>
-        </w:rPr>
-        <w:t>Example: "I acknowledge the use of Grammarly for improving spelling and grammar."</w:t>
-      </w:r>
-    </w:p>
-    <w:p>
-      <w:pPr>
-        <w:rPr>
-          <w:rFonts w:ascii="Aptos" w:eastAsia="Aptos" w:hAnsi="Aptos" w:cs="Aptos"/>
-          <w:color w:val="FF0000"/>
-          <w:sz w:val="24"/>
-          <w:szCs w:val="24"/>
-        </w:rPr>
-      </w:pPr>
-      <w:r>
-        <w:rPr>
-          <w:rFonts w:ascii="Aptos" w:eastAsia="Aptos" w:hAnsi="Aptos" w:cs="Aptos"/>
-          <w:color w:val="FF0000"/>
-          <w:sz w:val="24"/>
-          <w:szCs w:val="24"/>
-        </w:rPr>
-        <w:t>OR: "I acknowledge the use of ChatGPT for structuring the assignment."</w:t>
-      </w:r>
-    </w:p>
-    <w:p>
-      <w:pPr>
-        <w:rPr>
-          <w:rFonts w:ascii="Aptos" w:eastAsia="Aptos" w:hAnsi="Aptos" w:cs="Aptos"/>
-          <w:color w:val="FF0000"/>
-          <w:sz w:val="24"/>
-          <w:szCs w:val="24"/>
-        </w:rPr>
-      </w:pPr>
-      <w:r>
-        <w:rPr>
-          <w:rFonts w:ascii="Aptos" w:eastAsia="Aptos" w:hAnsi="Aptos" w:cs="Aptos"/>
-          <w:color w:val="FF0000"/>
-          <w:sz w:val="24"/>
-          <w:szCs w:val="24"/>
-        </w:rPr>
-        <w:t>Additionally, if you have used AI-generated content to inform a particular section of an assignment, you should cite its use as though you are referencing any other resource such as a journal article or book. You should then provide an appendix that shows the prompt you used, and text generated by the AI tool as evidence.</w:t>
-      </w:r>
-    </w:p>
-    <w:p>
-      <w:pPr>
-        <w:rPr>
-          <w:rFonts w:ascii="Aptos" w:eastAsia="Aptos" w:hAnsi="Aptos" w:cs="Aptos"/>
-          <w:color w:val="FF0000"/>
-          <w:sz w:val="24"/>
-          <w:szCs w:val="24"/>
-        </w:rPr>
-      </w:pPr>
-      <w:r>
-        <w:rPr>
-          <w:rFonts w:ascii="Aptos" w:eastAsia="Aptos" w:hAnsi="Aptos" w:cs="Aptos"/>
-          <w:color w:val="FF0000"/>
-          <w:sz w:val="24"/>
-          <w:szCs w:val="24"/>
-        </w:rPr>
-        <w:t>Information on how to reference AI tools is available in the Harvard Referencing Handbook, which can be downloaded at:</w:t>
-      </w:r>
-      <w:r>
-        <w:t xml:space="preserve"> </w:t>
-      </w:r>
-      <w:r>
-        <w:rPr>
-          <w:rFonts w:ascii="Aptos" w:eastAsia="Aptos" w:hAnsi="Aptos" w:cs="Aptos"/>
-          <w:color w:val="FF0000"/>
-          <w:sz w:val="24"/>
-          <w:szCs w:val="24"/>
-        </w:rPr>
-        <w:t>https://library.cct.ie/referencing/harvard</w:t>
-      </w:r>
-    </w:p>
-    <w:p>
-      <w:pPr>
-        <w:rPr>
-          <w:rFonts w:ascii="Aptos" w:eastAsia="Aptos" w:hAnsi="Aptos" w:cs="Aptos"/>
-          <w:b/>
-          <w:color w:val="FF0000"/>
-          <w:sz w:val="24"/>
-          <w:szCs w:val="24"/>
-        </w:rPr>
-      </w:pPr>
-    </w:p>
-    <w:p>
-      <w:pPr>
-        <w:rPr>
-          <w:rFonts w:ascii="Aptos" w:eastAsia="Aptos" w:hAnsi="Aptos" w:cs="Aptos"/>
-          <w:color w:val="FF0000"/>
-          <w:sz w:val="24"/>
-          <w:szCs w:val="24"/>
-        </w:rPr>
-      </w:pPr>
-      <w:r>
-        <w:rPr>
-          <w:rFonts w:ascii="Aptos" w:eastAsia="Aptos" w:hAnsi="Aptos" w:cs="Aptos"/>
-          <w:b/>
-          <w:color w:val="FF0000"/>
-          <w:sz w:val="24"/>
-          <w:szCs w:val="24"/>
-        </w:rPr>
-        <w:t>If you did not use AI tools</w:t>
-      </w:r>
-      <w:r>
-        <w:rPr>
-          <w:rFonts w:ascii="Aptos" w:eastAsia="Aptos" w:hAnsi="Aptos" w:cs="Aptos"/>
-          <w:color w:val="FF0000"/>
-          <w:sz w:val="24"/>
-          <w:szCs w:val="24"/>
-        </w:rPr>
-        <w:t>: delete the first statement and keep the second one.</w:t>
-      </w:r>
-    </w:p>
-    <w:p>
-      <w:pPr>
-        <w:rPr>
-          <w:rFonts w:ascii="Aptos" w:eastAsia="Aptos" w:hAnsi="Aptos" w:cs="Aptos"/>
-          <w:color w:val="FF0000"/>
-          <w:sz w:val="24"/>
-          <w:szCs w:val="24"/>
-        </w:rPr>
-      </w:pPr>
-    </w:p>
-    <w:p>
-      <w:pPr>
-        <w:spacing w:line="240" w:lineRule="auto"/>
-        <w:rPr>
-          <w:rFonts w:ascii="Times New Roman" w:eastAsia="Times New Roman" w:hAnsi="Times New Roman" w:cs="Times New Roman"/>
-          <w:color w:val="FF0000"/>
-          <w:sz w:val="24"/>
-          <w:szCs w:val="24"/>
-        </w:rPr>
-      </w:pPr>
-      <w:r>
-        <w:rPr>
-          <w:rFonts w:ascii="Aptos" w:eastAsia="Times New Roman" w:hAnsi="Aptos" w:cs="Times New Roman"/>
           <w:b/>
           <w:bCs/>
-          <w:color w:val="FF0000"/>
-          <w:sz w:val="30"/>
-          <w:szCs w:val="30"/>
-          <w:u w:val="single"/>
-        </w:rPr>
-        <w:t>Please read all the instructions on this document carefully!!!</w:t>
-      </w:r>
-    </w:p>
-    <w:p>
-      <w:pPr>
-        <w:spacing w:after="0" w:line="240" w:lineRule="auto"/>
-        <w:rPr>
-          <w:rFonts w:ascii="Times New Roman" w:eastAsia="Times New Roman" w:hAnsi="Times New Roman" w:cs="Times New Roman"/>
-          <w:color w:val="FF0000"/>
-          <w:sz w:val="24"/>
-          <w:szCs w:val="24"/>
-        </w:rPr>
-      </w:pPr>
-    </w:p>
-    <w:p>
-      <w:pPr>
-        <w:pStyle w:val="ListParagraph"/>
-        <w:numPr>
-          <w:ilvl w:val="0"/>
-          <w:numId w:val="15"/>
-        </w:numPr>
-        <w:spacing w:line="240" w:lineRule="auto"/>
-        <w:rPr>
-          <w:rFonts w:ascii="Times New Roman" w:eastAsia="Times New Roman" w:hAnsi="Times New Roman" w:cs="Times New Roman"/>
-          <w:color w:val="FF0000"/>
-          <w:sz w:val="24"/>
-          <w:szCs w:val="24"/>
-        </w:rPr>
-      </w:pPr>
-      <w:r>
-        <w:rPr>
-          <w:rFonts w:ascii="Aptos" w:eastAsia="Times New Roman" w:hAnsi="Aptos" w:cs="Times New Roman"/>
-          <w:b/>
-          <w:bCs/>
-          <w:color w:val="FF0000"/>
-          <w:sz w:val="24"/>
-          <w:szCs w:val="24"/>
-        </w:rPr>
-        <w:t>Filling out the cover sheet</w:t>
-      </w:r>
-    </w:p>
-    <w:p>
-      <w:pPr>
-        <w:spacing w:line="240" w:lineRule="auto"/>
-        <w:ind w:left="720"/>
-        <w:rPr>
-          <w:rFonts w:ascii="Times New Roman" w:eastAsia="Times New Roman" w:hAnsi="Times New Roman" w:cs="Times New Roman"/>
-          <w:color w:val="FF0000"/>
-          <w:sz w:val="24"/>
-          <w:szCs w:val="24"/>
-        </w:rPr>
-      </w:pPr>
-      <w:r>
-        <w:rPr>
-          <w:rFonts w:ascii="Aptos" w:eastAsia="Times New Roman" w:hAnsi="Aptos" w:cs="Times New Roman"/>
-          <w:color w:val="FF0000"/>
-          <w:sz w:val="24"/>
-          <w:szCs w:val="24"/>
-        </w:rPr>
-        <w:t>Fill out the top section of the cover page with all the required information.</w:t>
-      </w:r>
-    </w:p>
-    <w:p>
-      <w:pPr>
-        <w:spacing w:after="0" w:line="240" w:lineRule="auto"/>
-        <w:ind w:left="720"/>
-        <w:rPr>
-          <w:rFonts w:ascii="Times New Roman" w:eastAsia="Times New Roman" w:hAnsi="Times New Roman" w:cs="Times New Roman"/>
-          <w:color w:val="FF0000"/>
-          <w:sz w:val="24"/>
-          <w:szCs w:val="24"/>
-        </w:rPr>
-      </w:pPr>
-    </w:p>
-    <w:p>
-      <w:pPr>
-        <w:spacing w:line="240" w:lineRule="auto"/>
-        <w:ind w:left="720"/>
-        <w:rPr>
-          <w:rFonts w:ascii="Times New Roman" w:eastAsia="Times New Roman" w:hAnsi="Times New Roman" w:cs="Times New Roman"/>
-          <w:color w:val="FF0000"/>
-          <w:sz w:val="24"/>
-          <w:szCs w:val="24"/>
-        </w:rPr>
-      </w:pPr>
-      <w:r>
-        <w:rPr>
-          <w:rFonts w:ascii="Aptos" w:eastAsia="Times New Roman" w:hAnsi="Aptos" w:cs="Times New Roman"/>
-          <w:color w:val="FF0000"/>
-          <w:sz w:val="24"/>
-          <w:szCs w:val="24"/>
-        </w:rPr>
-        <w:t>In the "Use of AI" section, choose the statement that accurately reflects your work:</w:t>
-      </w:r>
-    </w:p>
-    <w:p>
-      <w:pPr>
-        <w:spacing w:after="0" w:line="240" w:lineRule="auto"/>
-        <w:ind w:left="720"/>
-        <w:rPr>
-          <w:rFonts w:ascii="Times New Roman" w:eastAsia="Times New Roman" w:hAnsi="Times New Roman" w:cs="Times New Roman"/>
-          <w:color w:val="FF0000"/>
-          <w:sz w:val="24"/>
-          <w:szCs w:val="24"/>
-        </w:rPr>
-      </w:pPr>
-    </w:p>
-    <w:p>
-      <w:pPr>
-        <w:spacing w:line="240" w:lineRule="auto"/>
-        <w:ind w:left="720"/>
-        <w:rPr>
-          <w:rFonts w:ascii="Times New Roman" w:eastAsia="Times New Roman" w:hAnsi="Times New Roman" w:cs="Times New Roman"/>
-          <w:color w:val="FF0000"/>
-          <w:sz w:val="24"/>
-          <w:szCs w:val="24"/>
-        </w:rPr>
-      </w:pPr>
-      <w:r>
-        <w:rPr>
-          <w:rFonts w:ascii="Aptos" w:eastAsia="Times New Roman" w:hAnsi="Aptos" w:cs="Times New Roman"/>
-          <w:b/>
-          <w:bCs/>
-          <w:color w:val="FF0000"/>
-          <w:sz w:val="24"/>
-          <w:szCs w:val="24"/>
-        </w:rPr>
-        <w:t>If you utilized AI</w:t>
-      </w:r>
-      <w:r>
-        <w:rPr>
-          <w:rFonts w:ascii="Aptos" w:eastAsia="Times New Roman" w:hAnsi="Aptos" w:cs="Times New Roman"/>
-          <w:color w:val="FF0000"/>
-          <w:sz w:val="24"/>
-          <w:szCs w:val="24"/>
-        </w:rPr>
-        <w:t>: select the first statement. Provide details about the AI tool used and its application. Delete the second statement.</w:t>
-      </w:r>
-    </w:p>
-    <w:p>
-      <w:pPr>
-        <w:spacing w:line="240" w:lineRule="auto"/>
-        <w:ind w:left="720"/>
-        <w:rPr>
-          <w:rFonts w:ascii="Times New Roman" w:eastAsia="Times New Roman" w:hAnsi="Times New Roman" w:cs="Times New Roman"/>
-          <w:color w:val="FF0000"/>
-          <w:sz w:val="24"/>
-          <w:szCs w:val="24"/>
-        </w:rPr>
-      </w:pPr>
-      <w:r>
-        <w:rPr>
-          <w:rFonts w:ascii="Aptos" w:eastAsia="Times New Roman" w:hAnsi="Aptos" w:cs="Times New Roman"/>
-          <w:color w:val="FF0000"/>
-          <w:sz w:val="24"/>
-          <w:szCs w:val="24"/>
-        </w:rPr>
-        <w:t>Example: "I acknowledge the use of Grammarly for improving spelling and grammar."</w:t>
-      </w:r>
-    </w:p>
-    <w:p>
-      <w:pPr>
-        <w:spacing w:line="240" w:lineRule="auto"/>
-        <w:ind w:left="720"/>
-        <w:rPr>
-          <w:rFonts w:ascii="Times New Roman" w:eastAsia="Times New Roman" w:hAnsi="Times New Roman" w:cs="Times New Roman"/>
-          <w:color w:val="FF0000"/>
-          <w:sz w:val="24"/>
-          <w:szCs w:val="24"/>
-        </w:rPr>
-      </w:pPr>
-      <w:r>
-        <w:rPr>
-          <w:rFonts w:ascii="Aptos" w:eastAsia="Times New Roman" w:hAnsi="Aptos" w:cs="Times New Roman"/>
-          <w:color w:val="FF0000"/>
-          <w:sz w:val="24"/>
-          <w:szCs w:val="24"/>
-        </w:rPr>
-        <w:lastRenderedPageBreak/>
-        <w:t>OR: "I acknowledge the use of ChatGPT for structuring the assignment."</w:t>
-      </w:r>
-    </w:p>
-    <w:p>
-      <w:pPr>
-        <w:spacing w:line="240" w:lineRule="auto"/>
-        <w:ind w:left="720"/>
-        <w:rPr>
-          <w:rFonts w:ascii="Times New Roman" w:eastAsia="Times New Roman" w:hAnsi="Times New Roman" w:cs="Times New Roman"/>
-          <w:color w:val="FF0000"/>
-          <w:sz w:val="24"/>
-          <w:szCs w:val="24"/>
-        </w:rPr>
-      </w:pPr>
-      <w:r>
-        <w:rPr>
-          <w:rFonts w:ascii="Aptos" w:eastAsia="Times New Roman" w:hAnsi="Aptos" w:cs="Times New Roman"/>
-          <w:color w:val="FF0000"/>
-          <w:sz w:val="24"/>
-          <w:szCs w:val="24"/>
-        </w:rPr>
-        <w:t>Additionally, if you have used AI-generated content to inform a particular section of an assignment, you should cite its use as though you are referencing any other resource such as a journal article or book. You should then provide an appendix that shows the prompt you used, and text generated by the AI tool as evidence.</w:t>
-      </w:r>
-    </w:p>
-    <w:p>
-      <w:pPr>
-        <w:spacing w:line="240" w:lineRule="auto"/>
-        <w:ind w:left="720"/>
-        <w:rPr>
-          <w:rFonts w:ascii="Times New Roman" w:eastAsia="Times New Roman" w:hAnsi="Times New Roman" w:cs="Times New Roman"/>
-          <w:color w:val="FF0000"/>
-          <w:sz w:val="24"/>
-          <w:szCs w:val="24"/>
-        </w:rPr>
-      </w:pPr>
-      <w:r>
-        <w:rPr>
-          <w:rFonts w:ascii="Aptos" w:eastAsia="Times New Roman" w:hAnsi="Aptos" w:cs="Times New Roman"/>
-          <w:color w:val="FF0000"/>
-          <w:sz w:val="24"/>
-          <w:szCs w:val="24"/>
-        </w:rPr>
-        <w:t>Information on how to reference AI tools is available in the Harvard Referencing Handbook, which can be downloaded at:</w:t>
-      </w:r>
-      <w:r>
-        <w:rPr>
-          <w:rFonts w:eastAsia="Times New Roman"/>
-          <w:color w:val="FF0000"/>
-        </w:rPr>
-        <w:t xml:space="preserve"> </w:t>
-      </w:r>
-      <w:r>
-        <w:rPr>
-          <w:rFonts w:ascii="Aptos" w:eastAsia="Times New Roman" w:hAnsi="Aptos" w:cs="Times New Roman"/>
-          <w:color w:val="FF0000"/>
-          <w:sz w:val="24"/>
-          <w:szCs w:val="24"/>
-        </w:rPr>
-        <w:t>https://library.cct.ie/referencing/harvard</w:t>
-      </w:r>
-    </w:p>
-    <w:p>
-      <w:pPr>
-        <w:spacing w:after="0" w:line="240" w:lineRule="auto"/>
-        <w:ind w:left="720"/>
-        <w:rPr>
-          <w:rFonts w:ascii="Times New Roman" w:eastAsia="Times New Roman" w:hAnsi="Times New Roman" w:cs="Times New Roman"/>
-          <w:color w:val="FF0000"/>
-          <w:sz w:val="24"/>
-          <w:szCs w:val="24"/>
-        </w:rPr>
-      </w:pPr>
-    </w:p>
-    <w:p>
-      <w:pPr>
-        <w:spacing w:line="240" w:lineRule="auto"/>
-        <w:ind w:left="720"/>
-        <w:rPr>
-          <w:rFonts w:ascii="Aptos" w:eastAsia="Times New Roman" w:hAnsi="Aptos" w:cs="Times New Roman"/>
-          <w:color w:val="FF0000"/>
-          <w:sz w:val="24"/>
-          <w:szCs w:val="24"/>
-        </w:rPr>
-      </w:pPr>
-      <w:r>
-        <w:rPr>
-          <w:rFonts w:ascii="Aptos" w:eastAsia="Times New Roman" w:hAnsi="Aptos" w:cs="Times New Roman"/>
-          <w:b/>
-          <w:bCs/>
-          <w:color w:val="FF0000"/>
-          <w:sz w:val="24"/>
-          <w:szCs w:val="24"/>
-        </w:rPr>
-        <w:t>If you did not use AI tools</w:t>
-      </w:r>
-      <w:r>
-        <w:rPr>
-          <w:rFonts w:ascii="Aptos" w:eastAsia="Times New Roman" w:hAnsi="Aptos" w:cs="Times New Roman"/>
-          <w:color w:val="FF0000"/>
-          <w:sz w:val="24"/>
-          <w:szCs w:val="24"/>
-        </w:rPr>
-        <w:t>: delete the first statement and keep the second one.</w:t>
-      </w:r>
-    </w:p>
-    <w:p>
-      <w:pPr>
-        <w:spacing w:line="240" w:lineRule="auto"/>
-        <w:rPr>
-          <w:rFonts w:ascii="Aptos" w:eastAsia="Times New Roman" w:hAnsi="Aptos" w:cs="Times New Roman"/>
-          <w:color w:val="FF0000"/>
-          <w:sz w:val="24"/>
-          <w:szCs w:val="24"/>
-        </w:rPr>
-      </w:pPr>
-    </w:p>
-    <w:p>
-      <w:pPr>
-        <w:pStyle w:val="ListParagraph"/>
-        <w:numPr>
-          <w:ilvl w:val="0"/>
-          <w:numId w:val="14"/>
-        </w:numPr>
-        <w:rPr>
-          <w:b/>
-          <w:bCs/>
-          <w:color w:val="FF0000"/>
           <w:sz w:val="24"/>
           <w:szCs w:val="24"/>
         </w:rPr>
@@ -1745,343 +1148,457 @@
         <w:rPr>
           <w:b/>
           <w:bCs/>
-          <w:color w:val="FF0000"/>
           <w:sz w:val="24"/>
           <w:szCs w:val="24"/>
         </w:rPr>
-        <w:t>Version Control</w:t>
+        <w:t>Overview of AI Engagement</w:t>
       </w:r>
     </w:p>
     <w:p>
-      <w:pPr>
-        <w:spacing w:before="100" w:beforeAutospacing="1" w:after="100" w:afterAutospacing="1" w:line="240" w:lineRule="auto"/>
-        <w:ind w:left="720"/>
-        <w:outlineLvl w:val="2"/>
-        <w:rPr>
-          <w:rFonts w:eastAsia="Times New Roman" w:cs="Times New Roman"/>
-          <w:b/>
-          <w:bCs/>
-          <w:color w:val="FF0000"/>
-          <w:sz w:val="24"/>
-          <w:szCs w:val="24"/>
-        </w:rPr>
-      </w:pPr>
       <w:r>
-        <w:rPr>
-          <w:rFonts w:eastAsia="Times New Roman" w:cs="Times New Roman"/>
-          <w:b/>
-          <w:bCs/>
-          <w:color w:val="FF0000"/>
-          <w:sz w:val="24"/>
-          <w:szCs w:val="24"/>
-        </w:rPr>
-        <w:t>Enabling Version Control in Microsoft Word:</w:t>
+        <w:t>In accordance with CCT College Dublin’s Academic Integrity Policy and the AI Fluency Framework, Generative AI tools (Gemini) were utilized as collaborative thought partners during the development of this Capstone Project Proposal. AI was employed exclusively to support</w:t>
+      </w:r>
+      <w:r>
+        <w:t xml:space="preserve"> content refinement,</w:t>
+      </w:r>
+      <w:r>
+        <w:t xml:space="preserve"> structural organization, methodology design, and document formatting—not to generate unverified core content or replace independent academic analysis. </w:t>
       </w:r>
     </w:p>
     <w:p>
-      <w:pPr>
-        <w:spacing w:before="100" w:beforeAutospacing="1" w:after="100" w:afterAutospacing="1" w:line="240" w:lineRule="auto"/>
-        <w:ind w:left="720"/>
-        <w:rPr>
-          <w:rFonts w:eastAsia="Times New Roman" w:cs="Times New Roman"/>
-          <w:color w:val="FF0000"/>
-          <w:sz w:val="24"/>
-          <w:szCs w:val="24"/>
-        </w:rPr>
-      </w:pPr>
       <w:r>
-        <w:rPr>
-          <w:rFonts w:eastAsia="Times New Roman" w:cs="Times New Roman"/>
-          <w:color w:val="FF0000"/>
-          <w:sz w:val="24"/>
-          <w:szCs w:val="24"/>
-        </w:rPr>
-        <w:t>Version control in Microsoft Word can be achieved in a few ways. Here’s how to do it:</w:t>
+        <w:t>All AI-generated outputs were critically evaluated, adapted, and verified against assessment criteria and original Irish Open Data datasets (data.gov.ie) before integration.</w:t>
       </w:r>
     </w:p>
     <w:p>
       <w:pPr>
-        <w:spacing w:before="100" w:beforeAutospacing="1" w:after="100" w:afterAutospacing="1" w:line="240" w:lineRule="auto"/>
-        <w:ind w:left="720"/>
-        <w:outlineLvl w:val="3"/>
         <w:rPr>
-          <w:rFonts w:eastAsia="Times New Roman" w:cs="Times New Roman"/>
           <w:b/>
           <w:bCs/>
-          <w:color w:val="FF0000"/>
-          <w:sz w:val="24"/>
-          <w:szCs w:val="24"/>
         </w:rPr>
       </w:pPr>
       <w:r>
         <w:rPr>
-          <w:rFonts w:eastAsia="Times New Roman" w:cs="Times New Roman"/>
           <w:b/>
           <w:bCs/>
-          <w:color w:val="FF0000"/>
-          <w:sz w:val="24"/>
-          <w:szCs w:val="24"/>
         </w:rPr>
-        <w:t>1. Using Track Changes:</w:t>
+        <w:t>Reflection across the 4D AI Fluency Competencies</w:t>
+      </w:r>
+    </w:p>
+    <w:tbl>
+      <w:tblPr>
+        <w:tblW w:w="0" w:type="auto"/>
+        <w:tblCellSpacing w:w="15" w:type="dxa"/>
+        <w:tblCellMar>
+          <w:top w:w="15" w:type="dxa"/>
+          <w:left w:w="15" w:type="dxa"/>
+          <w:bottom w:w="15" w:type="dxa"/>
+          <w:right w:w="15" w:type="dxa"/>
+        </w:tblCellMar>
+        <w:tblLook w:val="04A0" w:firstRow="1" w:lastRow="0" w:firstColumn="1" w:lastColumn="0" w:noHBand="0" w:noVBand="1"/>
+      </w:tblPr>
+      <w:tblGrid>
+        <w:gridCol w:w="2304"/>
+        <w:gridCol w:w="6706"/>
+      </w:tblGrid>
+      <w:tr>
+        <w:trPr>
+          <w:tblHeader/>
+          <w:tblCellSpacing w:w="15" w:type="dxa"/>
+        </w:trPr>
+        <w:tc>
+          <w:tcPr>
+            <w:tcW w:w="0" w:type="auto"/>
+            <w:tcBorders>
+              <w:top w:val="single" w:sz="6" w:space="0" w:color="C4C7C5"/>
+              <w:left w:val="single" w:sz="6" w:space="0" w:color="C4C7C5"/>
+              <w:bottom w:val="single" w:sz="6" w:space="0" w:color="C4C7C5"/>
+              <w:right w:val="single" w:sz="6" w:space="0" w:color="C4C7C5"/>
+            </w:tcBorders>
+            <w:tcMar>
+              <w:top w:w="120" w:type="dxa"/>
+              <w:left w:w="180" w:type="dxa"/>
+              <w:bottom w:w="120" w:type="dxa"/>
+              <w:right w:w="180" w:type="dxa"/>
+            </w:tcMar>
+            <w:vAlign w:val="center"/>
+            <w:hideMark/>
+          </w:tcPr>
+          <w:p>
+            <w:r>
+              <w:rPr>
+                <w:b/>
+                <w:bCs/>
+              </w:rPr>
+              <w:t>Competency</w:t>
+            </w:r>
+          </w:p>
+        </w:tc>
+        <w:tc>
+          <w:tcPr>
+            <w:tcW w:w="0" w:type="auto"/>
+            <w:tcBorders>
+              <w:top w:val="single" w:sz="6" w:space="0" w:color="C4C7C5"/>
+              <w:left w:val="single" w:sz="6" w:space="0" w:color="C4C7C5"/>
+              <w:bottom w:val="single" w:sz="6" w:space="0" w:color="C4C7C5"/>
+              <w:right w:val="single" w:sz="6" w:space="0" w:color="C4C7C5"/>
+            </w:tcBorders>
+            <w:tcMar>
+              <w:top w:w="120" w:type="dxa"/>
+              <w:left w:w="180" w:type="dxa"/>
+              <w:bottom w:w="120" w:type="dxa"/>
+              <w:right w:w="180" w:type="dxa"/>
+            </w:tcMar>
+            <w:vAlign w:val="center"/>
+            <w:hideMark/>
+          </w:tcPr>
+          <w:p>
+            <w:r>
+              <w:rPr>
+                <w:b/>
+                <w:bCs/>
+              </w:rPr>
+              <w:t>Summary of Responsible Use &amp; Application</w:t>
+            </w:r>
+          </w:p>
+        </w:tc>
+      </w:tr>
+      <w:tr>
+        <w:trPr>
+          <w:tblCellSpacing w:w="15" w:type="dxa"/>
+        </w:trPr>
+        <w:tc>
+          <w:tcPr>
+            <w:tcW w:w="0" w:type="auto"/>
+            <w:tcBorders>
+              <w:top w:val="single" w:sz="6" w:space="0" w:color="C4C7C5"/>
+              <w:left w:val="single" w:sz="6" w:space="0" w:color="C4C7C5"/>
+              <w:bottom w:val="single" w:sz="6" w:space="0" w:color="C4C7C5"/>
+              <w:right w:val="single" w:sz="6" w:space="0" w:color="C4C7C5"/>
+            </w:tcBorders>
+            <w:tcMar>
+              <w:top w:w="120" w:type="dxa"/>
+              <w:left w:w="180" w:type="dxa"/>
+              <w:bottom w:w="120" w:type="dxa"/>
+              <w:right w:w="180" w:type="dxa"/>
+            </w:tcMar>
+            <w:vAlign w:val="center"/>
+            <w:hideMark/>
+          </w:tcPr>
+          <w:p>
+            <w:r>
+              <w:rPr>
+                <w:b/>
+                <w:bCs/>
+              </w:rPr>
+              <w:t>Delegation</w:t>
+            </w:r>
+            <w:r>
+              <w:t xml:space="preserve"> </w:t>
+            </w:r>
+            <w:r>
+              <w:rPr>
+                <w:i/>
+                <w:iCs/>
+              </w:rPr>
+              <w:t>(Deciding whether &amp; when to use AI)</w:t>
+            </w:r>
+          </w:p>
+        </w:tc>
+        <w:tc>
+          <w:tcPr>
+            <w:tcW w:w="0" w:type="auto"/>
+            <w:tcBorders>
+              <w:top w:val="single" w:sz="6" w:space="0" w:color="C4C7C5"/>
+              <w:left w:val="single" w:sz="6" w:space="0" w:color="C4C7C5"/>
+              <w:bottom w:val="single" w:sz="6" w:space="0" w:color="C4C7C5"/>
+              <w:right w:val="single" w:sz="6" w:space="0" w:color="C4C7C5"/>
+            </w:tcBorders>
+            <w:tcMar>
+              <w:top w:w="120" w:type="dxa"/>
+              <w:left w:w="180" w:type="dxa"/>
+              <w:bottom w:w="120" w:type="dxa"/>
+              <w:right w:w="180" w:type="dxa"/>
+            </w:tcMar>
+            <w:vAlign w:val="center"/>
+            <w:hideMark/>
+          </w:tcPr>
+          <w:p>
+            <w:r>
+              <w:t xml:space="preserve">AI was delegated tasks such as outlining assessment sections, suggesting potential capstone business problems using Irish open datasets, drafting LaTeX/draw.io diagram syntax, and refining report layout. Core analytical decisions, domain selection, dataset integration logic, and final evaluation remained entirely human-driven. </w:t>
+            </w:r>
+          </w:p>
+        </w:tc>
+      </w:tr>
+      <w:tr>
+        <w:trPr>
+          <w:tblCellSpacing w:w="15" w:type="dxa"/>
+        </w:trPr>
+        <w:tc>
+          <w:tcPr>
+            <w:tcW w:w="0" w:type="auto"/>
+            <w:tcBorders>
+              <w:top w:val="single" w:sz="6" w:space="0" w:color="C4C7C5"/>
+              <w:left w:val="single" w:sz="6" w:space="0" w:color="C4C7C5"/>
+              <w:bottom w:val="single" w:sz="6" w:space="0" w:color="C4C7C5"/>
+              <w:right w:val="single" w:sz="6" w:space="0" w:color="C4C7C5"/>
+            </w:tcBorders>
+            <w:tcMar>
+              <w:top w:w="120" w:type="dxa"/>
+              <w:left w:w="180" w:type="dxa"/>
+              <w:bottom w:w="120" w:type="dxa"/>
+              <w:right w:w="180" w:type="dxa"/>
+            </w:tcMar>
+            <w:vAlign w:val="center"/>
+            <w:hideMark/>
+          </w:tcPr>
+          <w:p>
+            <w:r>
+              <w:rPr>
+                <w:b/>
+                <w:bCs/>
+              </w:rPr>
+              <w:t>Description</w:t>
+            </w:r>
+            <w:r>
+              <w:t xml:space="preserve"> </w:t>
+            </w:r>
+            <w:r>
+              <w:rPr>
+                <w:i/>
+                <w:iCs/>
+              </w:rPr>
+              <w:t>(Prompt Engineering)</w:t>
+            </w:r>
+          </w:p>
+        </w:tc>
+        <w:tc>
+          <w:tcPr>
+            <w:tcW w:w="0" w:type="auto"/>
+            <w:tcBorders>
+              <w:top w:val="single" w:sz="6" w:space="0" w:color="C4C7C5"/>
+              <w:left w:val="single" w:sz="6" w:space="0" w:color="C4C7C5"/>
+              <w:bottom w:val="single" w:sz="6" w:space="0" w:color="C4C7C5"/>
+              <w:right w:val="single" w:sz="6" w:space="0" w:color="C4C7C5"/>
+            </w:tcBorders>
+            <w:tcMar>
+              <w:top w:w="120" w:type="dxa"/>
+              <w:left w:w="180" w:type="dxa"/>
+              <w:bottom w:w="120" w:type="dxa"/>
+              <w:right w:w="180" w:type="dxa"/>
+            </w:tcMar>
+            <w:vAlign w:val="center"/>
+            <w:hideMark/>
+          </w:tcPr>
+          <w:p>
+            <w:r>
+              <w:t>Clear, contextual prompts were written detailing the academic module (</w:t>
+            </w:r>
+            <w:r>
+              <w:rPr>
+                <w:i/>
+                <w:iCs/>
+              </w:rPr>
+              <w:t>Strategic Thinking</w:t>
+            </w:r>
+            <w:r>
+              <w:t xml:space="preserve">), project constraints (1,500-word limit, 2-semester roadmap), data requirements (data.gov.ie), and specific assignment rubrics. Prompts were iterated sequentially to refine technical diagrams and methodology steps. </w:t>
+            </w:r>
+          </w:p>
+        </w:tc>
+      </w:tr>
+      <w:tr>
+        <w:trPr>
+          <w:tblCellSpacing w:w="15" w:type="dxa"/>
+        </w:trPr>
+        <w:tc>
+          <w:tcPr>
+            <w:tcW w:w="0" w:type="auto"/>
+            <w:tcBorders>
+              <w:top w:val="single" w:sz="6" w:space="0" w:color="C4C7C5"/>
+              <w:left w:val="single" w:sz="6" w:space="0" w:color="C4C7C5"/>
+              <w:bottom w:val="single" w:sz="6" w:space="0" w:color="C4C7C5"/>
+              <w:right w:val="single" w:sz="6" w:space="0" w:color="C4C7C5"/>
+            </w:tcBorders>
+            <w:tcMar>
+              <w:top w:w="120" w:type="dxa"/>
+              <w:left w:w="180" w:type="dxa"/>
+              <w:bottom w:w="120" w:type="dxa"/>
+              <w:right w:w="180" w:type="dxa"/>
+            </w:tcMar>
+            <w:vAlign w:val="center"/>
+            <w:hideMark/>
+          </w:tcPr>
+          <w:p>
+            <w:r>
+              <w:rPr>
+                <w:b/>
+                <w:bCs/>
+              </w:rPr>
+              <w:t>Discernment</w:t>
+            </w:r>
+            <w:r>
+              <w:t xml:space="preserve"> </w:t>
+            </w:r>
+            <w:r>
+              <w:rPr>
+                <w:i/>
+                <w:iCs/>
+              </w:rPr>
+              <w:t>(Evaluating Outputs)</w:t>
+            </w:r>
+          </w:p>
+        </w:tc>
+        <w:tc>
+          <w:tcPr>
+            <w:tcW w:w="0" w:type="auto"/>
+            <w:tcBorders>
+              <w:top w:val="single" w:sz="6" w:space="0" w:color="C4C7C5"/>
+              <w:left w:val="single" w:sz="6" w:space="0" w:color="C4C7C5"/>
+              <w:bottom w:val="single" w:sz="6" w:space="0" w:color="C4C7C5"/>
+              <w:right w:val="single" w:sz="6" w:space="0" w:color="C4C7C5"/>
+            </w:tcBorders>
+            <w:tcMar>
+              <w:top w:w="120" w:type="dxa"/>
+              <w:left w:w="180" w:type="dxa"/>
+              <w:bottom w:w="120" w:type="dxa"/>
+              <w:right w:w="180" w:type="dxa"/>
+            </w:tcMar>
+            <w:vAlign w:val="center"/>
+            <w:hideMark/>
+          </w:tcPr>
+          <w:p>
+            <w:r>
+              <w:t xml:space="preserve">All AI outputs were scrutinized for factual accuracy, alignment with Irish context (e.g., CSO vehicle datasets and municipal charging points), and assignment compliance. Structural suggestions were integrated, while overly broad or generic technical assumptions were rejected or modified. </w:t>
+            </w:r>
+          </w:p>
+        </w:tc>
+      </w:tr>
+      <w:tr>
+        <w:trPr>
+          <w:tblCellSpacing w:w="15" w:type="dxa"/>
+        </w:trPr>
+        <w:tc>
+          <w:tcPr>
+            <w:tcW w:w="0" w:type="auto"/>
+            <w:tcBorders>
+              <w:top w:val="single" w:sz="6" w:space="0" w:color="C4C7C5"/>
+              <w:left w:val="single" w:sz="6" w:space="0" w:color="C4C7C5"/>
+              <w:bottom w:val="single" w:sz="6" w:space="0" w:color="C4C7C5"/>
+              <w:right w:val="single" w:sz="6" w:space="0" w:color="C4C7C5"/>
+            </w:tcBorders>
+            <w:tcMar>
+              <w:top w:w="120" w:type="dxa"/>
+              <w:left w:w="180" w:type="dxa"/>
+              <w:bottom w:w="120" w:type="dxa"/>
+              <w:right w:w="180" w:type="dxa"/>
+            </w:tcMar>
+            <w:vAlign w:val="center"/>
+            <w:hideMark/>
+          </w:tcPr>
+          <w:p>
+            <w:r>
+              <w:rPr>
+                <w:b/>
+                <w:bCs/>
+              </w:rPr>
+              <w:t>Diligence</w:t>
+            </w:r>
+            <w:r>
+              <w:t xml:space="preserve"> </w:t>
+            </w:r>
+            <w:r>
+              <w:rPr>
+                <w:i/>
+                <w:iCs/>
+              </w:rPr>
+              <w:t>(Ethical Responsibility &amp; Citation)</w:t>
+            </w:r>
+          </w:p>
+        </w:tc>
+        <w:tc>
+          <w:tcPr>
+            <w:tcW w:w="0" w:type="auto"/>
+            <w:tcBorders>
+              <w:top w:val="single" w:sz="6" w:space="0" w:color="C4C7C5"/>
+              <w:left w:val="single" w:sz="6" w:space="0" w:color="C4C7C5"/>
+              <w:bottom w:val="single" w:sz="6" w:space="0" w:color="C4C7C5"/>
+              <w:right w:val="single" w:sz="6" w:space="0" w:color="C4C7C5"/>
+            </w:tcBorders>
+            <w:tcMar>
+              <w:top w:w="120" w:type="dxa"/>
+              <w:left w:w="180" w:type="dxa"/>
+              <w:bottom w:w="120" w:type="dxa"/>
+              <w:right w:w="180" w:type="dxa"/>
+            </w:tcMar>
+            <w:vAlign w:val="center"/>
+            <w:hideMark/>
+          </w:tcPr>
+          <w:p>
+            <w:r>
+              <w:t xml:space="preserve">No confidential, personal, or non-public data was shared with AI models. All external datasets and academic references cited throughout the proposal adhere strictly to CCT's Harvard Referencing guidelines. </w:t>
+            </w:r>
+          </w:p>
+        </w:tc>
+      </w:tr>
+    </w:tbl>
+    <w:p/>
+    <w:p>
+      <w:pPr>
+        <w:rPr>
+          <w:b/>
+          <w:bCs/>
+        </w:rPr>
+      </w:pPr>
+    </w:p>
+    <w:p>
+      <w:pPr>
+        <w:rPr>
+          <w:b/>
+          <w:bCs/>
+        </w:rPr>
+      </w:pPr>
+      <w:r>
+        <w:rPr>
+          <w:b/>
+          <w:bCs/>
+        </w:rPr>
+        <w:br w:type="page"/>
       </w:r>
     </w:p>
     <w:p>
       <w:pPr>
-        <w:numPr>
-          <w:ilvl w:val="0"/>
-          <w:numId w:val="16"/>
-        </w:numPr>
-        <w:tabs>
-          <w:tab w:val="clear" w:pos="720"/>
-          <w:tab w:val="num" w:pos="1440"/>
-        </w:tabs>
-        <w:spacing w:before="100" w:beforeAutospacing="1" w:after="100" w:afterAutospacing="1" w:line="240" w:lineRule="auto"/>
-        <w:ind w:left="1440"/>
         <w:rPr>
-          <w:rFonts w:eastAsia="Times New Roman" w:cs="Times New Roman"/>
-          <w:color w:val="FF0000"/>
-          <w:sz w:val="24"/>
-          <w:szCs w:val="24"/>
+          <w:b/>
+          <w:bCs/>
         </w:rPr>
       </w:pPr>
       <w:r>
         <w:rPr>
-          <w:rFonts w:eastAsia="Times New Roman" w:cs="Times New Roman"/>
           <w:b/>
           <w:bCs/>
-          <w:color w:val="FF0000"/>
-          <w:sz w:val="24"/>
-          <w:szCs w:val="24"/>
         </w:rPr>
-        <w:t>Track Changes</w:t>
-      </w:r>
-      <w:r>
-        <w:rPr>
-          <w:rFonts w:eastAsia="Times New Roman" w:cs="Times New Roman"/>
-          <w:color w:val="FF0000"/>
-          <w:sz w:val="24"/>
-          <w:szCs w:val="24"/>
-        </w:rPr>
-        <w:t xml:space="preserve"> is a built-in feature of Word that helps users monitor edits. </w:t>
+        <w:lastRenderedPageBreak/>
+        <w:t>Prompt Screenshot:</w:t>
       </w:r>
     </w:p>
     <w:p>
       <w:pPr>
-        <w:spacing w:before="100" w:beforeAutospacing="1" w:after="100" w:afterAutospacing="1" w:line="240" w:lineRule="auto"/>
-        <w:ind w:left="1440"/>
         <w:rPr>
-          <w:rFonts w:eastAsia="Times New Roman" w:cs="Times New Roman"/>
-          <w:color w:val="FF0000"/>
-          <w:sz w:val="24"/>
-          <w:szCs w:val="24"/>
+          <w:b/>
+          <w:bCs/>
         </w:rPr>
       </w:pPr>
       <w:r>
         <w:rPr>
-          <w:rFonts w:eastAsia="Times New Roman" w:cs="Times New Roman"/>
-          <w:color w:val="FF0000"/>
-          <w:sz w:val="24"/>
-          <w:szCs w:val="24"/>
-        </w:rPr>
-        <w:t>To enable:</w:t>
-      </w:r>
-    </w:p>
-    <w:p>
-      <w:pPr>
-        <w:numPr>
-          <w:ilvl w:val="1"/>
-          <w:numId w:val="16"/>
-        </w:numPr>
-        <w:tabs>
-          <w:tab w:val="clear" w:pos="1440"/>
-          <w:tab w:val="num" w:pos="2160"/>
-        </w:tabs>
-        <w:spacing w:before="100" w:beforeAutospacing="1" w:after="100" w:afterAutospacing="1" w:line="240" w:lineRule="auto"/>
-        <w:ind w:left="2160"/>
-        <w:rPr>
-          <w:rFonts w:eastAsia="Times New Roman" w:cs="Times New Roman"/>
-          <w:color w:val="FF0000"/>
-          <w:sz w:val="24"/>
-          <w:szCs w:val="24"/>
-        </w:rPr>
-      </w:pPr>
-      <w:r>
-        <w:rPr>
-          <w:rFonts w:eastAsia="Times New Roman" w:cs="Times New Roman"/>
-          <w:color w:val="FF0000"/>
-          <w:sz w:val="24"/>
-          <w:szCs w:val="24"/>
-        </w:rPr>
-        <w:t xml:space="preserve">Go to the </w:t>
-      </w:r>
-      <w:r>
-        <w:rPr>
-          <w:rFonts w:eastAsia="Times New Roman" w:cs="Times New Roman"/>
           <w:b/>
           <w:bCs/>
-          <w:color w:val="FF0000"/>
-          <w:sz w:val="24"/>
-          <w:szCs w:val="24"/>
-        </w:rPr>
-        <w:t>Review</w:t>
-      </w:r>
-      <w:r>
-        <w:rPr>
-          <w:rFonts w:eastAsia="Times New Roman" w:cs="Times New Roman"/>
-          <w:color w:val="FF0000"/>
-          <w:sz w:val="24"/>
-          <w:szCs w:val="24"/>
-        </w:rPr>
-        <w:t xml:space="preserve"> tab.</w:t>
-      </w:r>
-    </w:p>
-    <w:p>
-      <w:pPr>
-        <w:numPr>
-          <w:ilvl w:val="1"/>
-          <w:numId w:val="16"/>
-        </w:numPr>
-        <w:tabs>
-          <w:tab w:val="clear" w:pos="1440"/>
-          <w:tab w:val="num" w:pos="2160"/>
-        </w:tabs>
-        <w:spacing w:before="100" w:beforeAutospacing="1" w:after="100" w:afterAutospacing="1" w:line="240" w:lineRule="auto"/>
-        <w:ind w:left="2160"/>
-        <w:rPr>
-          <w:rFonts w:eastAsia="Times New Roman" w:cs="Times New Roman"/>
-          <w:color w:val="FF0000"/>
-          <w:sz w:val="24"/>
-          <w:szCs w:val="24"/>
-        </w:rPr>
-      </w:pPr>
-      <w:r>
-        <w:rPr>
-          <w:rFonts w:eastAsia="Times New Roman" w:cs="Times New Roman"/>
-          <w:color w:val="FF0000"/>
-          <w:sz w:val="24"/>
-          <w:szCs w:val="24"/>
-        </w:rPr>
-        <w:t xml:space="preserve">Click </w:t>
-      </w:r>
-      <w:r>
-        <w:rPr>
-          <w:rFonts w:eastAsia="Times New Roman" w:cs="Times New Roman"/>
-          <w:b/>
-          <w:bCs/>
-          <w:color w:val="FF0000"/>
-          <w:sz w:val="24"/>
-          <w:szCs w:val="24"/>
-        </w:rPr>
-        <w:t>Track Changes</w:t>
-      </w:r>
-      <w:r>
-        <w:rPr>
-          <w:rFonts w:eastAsia="Times New Roman" w:cs="Times New Roman"/>
-          <w:color w:val="FF0000"/>
-          <w:sz w:val="24"/>
-          <w:szCs w:val="24"/>
-        </w:rPr>
-        <w:t xml:space="preserve"> </w:t>
-      </w:r>
-    </w:p>
-    <w:p>
-      <w:pPr>
-        <w:numPr>
-          <w:ilvl w:val="1"/>
-          <w:numId w:val="16"/>
-        </w:numPr>
-        <w:tabs>
-          <w:tab w:val="clear" w:pos="1440"/>
-          <w:tab w:val="num" w:pos="2160"/>
-        </w:tabs>
-        <w:spacing w:before="100" w:beforeAutospacing="1" w:after="100" w:afterAutospacing="1" w:line="240" w:lineRule="auto"/>
-        <w:ind w:left="2160"/>
-        <w:rPr>
-          <w:rFonts w:eastAsia="Times New Roman" w:cs="Times New Roman"/>
-          <w:color w:val="FF0000"/>
-          <w:sz w:val="24"/>
-          <w:szCs w:val="24"/>
-        </w:rPr>
-      </w:pPr>
-      <w:r>
-        <w:rPr>
-          <w:rFonts w:eastAsia="Times New Roman" w:cs="Times New Roman"/>
-          <w:color w:val="FF0000"/>
-          <w:sz w:val="24"/>
-          <w:szCs w:val="24"/>
-        </w:rPr>
-        <w:t>Word will start recording changes and can show who made each edit.</w:t>
-      </w:r>
-    </w:p>
-    <w:p>
-      <w:pPr>
-        <w:numPr>
-          <w:ilvl w:val="1"/>
-          <w:numId w:val="16"/>
-        </w:numPr>
-        <w:tabs>
-          <w:tab w:val="clear" w:pos="1440"/>
-          <w:tab w:val="num" w:pos="2160"/>
-        </w:tabs>
-        <w:spacing w:before="100" w:beforeAutospacing="1" w:after="100" w:afterAutospacing="1" w:line="240" w:lineRule="auto"/>
-        <w:ind w:left="2160"/>
-        <w:rPr>
-          <w:rFonts w:eastAsia="Times New Roman" w:cs="Times New Roman"/>
-          <w:color w:val="FF0000"/>
-          <w:sz w:val="24"/>
-          <w:szCs w:val="24"/>
-        </w:rPr>
-      </w:pPr>
-      <w:r>
-        <w:rPr>
-          <w:rFonts w:eastAsia="Times New Roman" w:cs="Times New Roman"/>
-          <w:color w:val="FF0000"/>
-          <w:sz w:val="24"/>
-          <w:szCs w:val="24"/>
-        </w:rPr>
-        <w:t xml:space="preserve">Select </w:t>
-      </w:r>
-      <w:r>
-        <w:rPr>
-          <w:rFonts w:eastAsia="Times New Roman" w:cs="Times New Roman"/>
-          <w:b/>
-          <w:bCs/>
-          <w:color w:val="FF0000"/>
-          <w:sz w:val="24"/>
-          <w:szCs w:val="24"/>
-        </w:rPr>
-        <w:t>No Markup</w:t>
-      </w:r>
-      <w:r>
-        <w:rPr>
-          <w:rFonts w:eastAsia="Times New Roman" w:cs="Times New Roman"/>
-          <w:color w:val="FF0000"/>
-          <w:sz w:val="24"/>
-          <w:szCs w:val="24"/>
-        </w:rPr>
-        <w:t xml:space="preserve"> from the drop-down menu.</w:t>
-      </w:r>
-    </w:p>
-    <w:p>
-      <w:pPr>
-        <w:spacing w:before="100" w:beforeAutospacing="1" w:after="100" w:afterAutospacing="1" w:line="240" w:lineRule="auto"/>
-        <w:ind w:left="2160"/>
-        <w:rPr>
-          <w:rFonts w:eastAsia="Times New Roman" w:cs="Times New Roman"/>
-          <w:color w:val="FF0000"/>
-          <w:sz w:val="24"/>
-          <w:szCs w:val="24"/>
-        </w:rPr>
-      </w:pPr>
-      <w:r>
-        <w:rPr>
-          <w:noProof/>
         </w:rPr>
         <w:drawing>
-          <wp:inline distT="0" distB="0" distL="0" distR="0" wp14:anchorId="21739DAA" wp14:editId="6B744597">
-            <wp:extent cx="2047875" cy="1038225"/>
-            <wp:effectExtent l="0" t="0" r="9525" b="9525"/>
-            <wp:docPr id="86440146" name="Picture 1" descr="A screenshot of a computer&#10;&#10;Description automatically generated"/>
+          <wp:inline distT="0" distB="0" distL="0" distR="0" wp14:anchorId="66CDBBC0" wp14:editId="7DA8B194">
+            <wp:extent cx="5731510" cy="2774315"/>
+            <wp:effectExtent l="0" t="0" r="2540" b="6985"/>
+            <wp:docPr id="36020143" name="Picture 1"/>
             <wp:cNvGraphicFramePr>
               <a:graphicFrameLocks xmlns:a="http://schemas.openxmlformats.org/drawingml/2006/main" noChangeAspect="1"/>
             </wp:cNvGraphicFramePr>
@@ -2089,11 +1606,11 @@
               <a:graphicData uri="http://schemas.openxmlformats.org/drawingml/2006/picture">
                 <pic:pic xmlns:pic="http://schemas.openxmlformats.org/drawingml/2006/picture">
                   <pic:nvPicPr>
-                    <pic:cNvPr id="86440146" name="Picture 1" descr="A screenshot of a computer&#10;&#10;Description automatically generated"/>
+                    <pic:cNvPr id="36020143" name=""/>
                     <pic:cNvPicPr/>
                   </pic:nvPicPr>
                   <pic:blipFill>
-                    <a:blip r:embed="rId7"/>
+                    <a:blip r:embed="rId9"/>
                     <a:stretch>
                       <a:fillRect/>
                     </a:stretch>
@@ -2101,7 +1618,7 @@
                   <pic:spPr>
                     <a:xfrm>
                       <a:off x="0" y="0"/>
-                      <a:ext cx="2047875" cy="1038225"/>
+                      <a:ext cx="5731510" cy="2774315"/>
                     </a:xfrm>
                     <a:prstGeom prst="rect">
                       <a:avLst/>
@@ -2116,1178 +1633,41 @@
     </w:p>
     <w:p>
       <w:pPr>
-        <w:spacing w:before="100" w:beforeAutospacing="1" w:after="100" w:afterAutospacing="1" w:line="240" w:lineRule="auto"/>
-        <w:ind w:left="720"/>
-        <w:outlineLvl w:val="3"/>
         <w:rPr>
-          <w:rFonts w:eastAsia="Times New Roman" w:cs="Times New Roman"/>
           <w:b/>
           <w:bCs/>
-          <w:color w:val="FF0000"/>
-          <w:sz w:val="24"/>
-          <w:szCs w:val="24"/>
+        </w:rPr>
+      </w:pPr>
+    </w:p>
+    <w:p>
+      <w:pPr>
+        <w:rPr>
+          <w:b/>
+          <w:bCs/>
         </w:rPr>
       </w:pPr>
       <w:r>
         <w:rPr>
-          <w:rFonts w:eastAsia="Times New Roman" w:cs="Times New Roman"/>
           <w:b/>
           <w:bCs/>
-          <w:color w:val="FF0000"/>
-          <w:sz w:val="24"/>
-          <w:szCs w:val="24"/>
-        </w:rPr>
-        <w:t>2. Using Microsoft OneDrive or SharePoint:</w:t>
-      </w:r>
-    </w:p>
-    <w:p>
-      <w:pPr>
-        <w:numPr>
-          <w:ilvl w:val="0"/>
-          <w:numId w:val="17"/>
-        </w:numPr>
-        <w:tabs>
-          <w:tab w:val="clear" w:pos="720"/>
-          <w:tab w:val="num" w:pos="1440"/>
-        </w:tabs>
-        <w:spacing w:before="100" w:beforeAutospacing="1" w:after="100" w:afterAutospacing="1" w:line="240" w:lineRule="auto"/>
-        <w:ind w:left="1440"/>
-        <w:rPr>
-          <w:rFonts w:eastAsia="Times New Roman" w:cs="Times New Roman"/>
-          <w:color w:val="FF0000"/>
-          <w:sz w:val="24"/>
-          <w:szCs w:val="24"/>
-        </w:rPr>
-      </w:pPr>
-      <w:r>
-        <w:rPr>
-          <w:rFonts w:eastAsia="Times New Roman" w:cs="Times New Roman"/>
-          <w:color w:val="FF0000"/>
-          <w:sz w:val="24"/>
-          <w:szCs w:val="24"/>
-        </w:rPr>
-        <w:t xml:space="preserve">Save Word documents to </w:t>
-      </w:r>
-      <w:r>
-        <w:rPr>
-          <w:rFonts w:eastAsia="Times New Roman" w:cs="Times New Roman"/>
-          <w:b/>
-          <w:bCs/>
-          <w:color w:val="FF0000"/>
-          <w:sz w:val="24"/>
-          <w:szCs w:val="24"/>
-        </w:rPr>
-        <w:t>OneDrive</w:t>
-      </w:r>
-      <w:r>
-        <w:rPr>
-          <w:rFonts w:eastAsia="Times New Roman" w:cs="Times New Roman"/>
-          <w:color w:val="FF0000"/>
-          <w:sz w:val="24"/>
-          <w:szCs w:val="24"/>
-        </w:rPr>
-        <w:t xml:space="preserve"> or </w:t>
-      </w:r>
-      <w:r>
-        <w:rPr>
-          <w:rFonts w:eastAsia="Times New Roman" w:cs="Times New Roman"/>
-          <w:b/>
-          <w:bCs/>
-          <w:color w:val="FF0000"/>
-          <w:sz w:val="24"/>
-          <w:szCs w:val="24"/>
-        </w:rPr>
-        <w:t>SharePoint</w:t>
-      </w:r>
-      <w:r>
-        <w:rPr>
-          <w:rFonts w:eastAsia="Times New Roman" w:cs="Times New Roman"/>
-          <w:color w:val="FF0000"/>
-          <w:sz w:val="24"/>
-          <w:szCs w:val="24"/>
-        </w:rPr>
-        <w:t xml:space="preserve"> to automatically enable version history.</w:t>
-      </w:r>
-    </w:p>
-    <w:p>
-      <w:pPr>
-        <w:numPr>
-          <w:ilvl w:val="1"/>
-          <w:numId w:val="17"/>
-        </w:numPr>
-        <w:tabs>
-          <w:tab w:val="clear" w:pos="1440"/>
-          <w:tab w:val="num" w:pos="2160"/>
-        </w:tabs>
-        <w:spacing w:before="100" w:beforeAutospacing="1" w:after="100" w:afterAutospacing="1" w:line="240" w:lineRule="auto"/>
-        <w:ind w:left="2160"/>
-        <w:rPr>
-          <w:rFonts w:eastAsia="Times New Roman" w:cs="Times New Roman"/>
-          <w:color w:val="FF0000"/>
-          <w:sz w:val="24"/>
-          <w:szCs w:val="24"/>
-        </w:rPr>
-      </w:pPr>
-      <w:r>
-        <w:rPr>
-          <w:rFonts w:eastAsia="Times New Roman" w:cs="Times New Roman"/>
-          <w:color w:val="FF0000"/>
-          <w:sz w:val="24"/>
-          <w:szCs w:val="24"/>
-        </w:rPr>
-        <w:t xml:space="preserve">Go to </w:t>
-      </w:r>
-      <w:r>
-        <w:rPr>
-          <w:rFonts w:eastAsia="Times New Roman" w:cs="Times New Roman"/>
-          <w:b/>
-          <w:bCs/>
-          <w:color w:val="FF0000"/>
-          <w:sz w:val="24"/>
-          <w:szCs w:val="24"/>
-        </w:rPr>
-        <w:t>File</w:t>
-      </w:r>
-      <w:r>
-        <w:rPr>
-          <w:rFonts w:eastAsia="Times New Roman" w:cs="Times New Roman"/>
-          <w:color w:val="FF0000"/>
-          <w:sz w:val="24"/>
-          <w:szCs w:val="24"/>
-        </w:rPr>
-        <w:t xml:space="preserve"> &gt; </w:t>
-      </w:r>
-      <w:r>
-        <w:rPr>
-          <w:rFonts w:eastAsia="Times New Roman" w:cs="Times New Roman"/>
-          <w:b/>
-          <w:bCs/>
-          <w:color w:val="FF0000"/>
-          <w:sz w:val="24"/>
-          <w:szCs w:val="24"/>
-        </w:rPr>
-        <w:t>Save As</w:t>
-      </w:r>
-      <w:r>
-        <w:rPr>
-          <w:rFonts w:eastAsia="Times New Roman" w:cs="Times New Roman"/>
-          <w:color w:val="FF0000"/>
-          <w:sz w:val="24"/>
-          <w:szCs w:val="24"/>
-        </w:rPr>
-        <w:t xml:space="preserve"> &gt; </w:t>
-      </w:r>
-      <w:r>
-        <w:rPr>
-          <w:rFonts w:eastAsia="Times New Roman" w:cs="Times New Roman"/>
-          <w:b/>
-          <w:bCs/>
-          <w:color w:val="FF0000"/>
-          <w:sz w:val="24"/>
-          <w:szCs w:val="24"/>
-        </w:rPr>
-        <w:t>OneDrive</w:t>
-      </w:r>
-      <w:r>
-        <w:rPr>
-          <w:rFonts w:eastAsia="Times New Roman" w:cs="Times New Roman"/>
-          <w:color w:val="FF0000"/>
-          <w:sz w:val="24"/>
-          <w:szCs w:val="24"/>
-        </w:rPr>
-        <w:t xml:space="preserve"> or </w:t>
-      </w:r>
-      <w:r>
-        <w:rPr>
-          <w:rFonts w:eastAsia="Times New Roman" w:cs="Times New Roman"/>
-          <w:b/>
-          <w:bCs/>
-          <w:color w:val="FF0000"/>
-          <w:sz w:val="24"/>
-          <w:szCs w:val="24"/>
-        </w:rPr>
-        <w:t>SharePoint</w:t>
-      </w:r>
-      <w:r>
-        <w:rPr>
-          <w:rFonts w:eastAsia="Times New Roman" w:cs="Times New Roman"/>
-          <w:color w:val="FF0000"/>
-          <w:sz w:val="24"/>
-          <w:szCs w:val="24"/>
-        </w:rPr>
-        <w:t>.</w:t>
-      </w:r>
-    </w:p>
-    <w:p>
-      <w:pPr>
-        <w:numPr>
-          <w:ilvl w:val="1"/>
-          <w:numId w:val="17"/>
-        </w:numPr>
-        <w:tabs>
-          <w:tab w:val="clear" w:pos="1440"/>
-          <w:tab w:val="num" w:pos="2160"/>
-        </w:tabs>
-        <w:spacing w:before="100" w:beforeAutospacing="1" w:after="100" w:afterAutospacing="1" w:line="240" w:lineRule="auto"/>
-        <w:ind w:left="2160"/>
-        <w:rPr>
-          <w:rFonts w:eastAsia="Times New Roman" w:cs="Times New Roman"/>
-          <w:color w:val="FF0000"/>
-          <w:sz w:val="24"/>
-          <w:szCs w:val="24"/>
-        </w:rPr>
-      </w:pPr>
-      <w:r>
-        <w:rPr>
-          <w:rFonts w:eastAsia="Times New Roman" w:cs="Times New Roman"/>
-          <w:color w:val="FF0000"/>
-          <w:sz w:val="24"/>
-          <w:szCs w:val="24"/>
-        </w:rPr>
-        <w:t xml:space="preserve">In OneDrive or SharePoint, right-click the document, and select </w:t>
-      </w:r>
-      <w:r>
-        <w:rPr>
-          <w:rFonts w:eastAsia="Times New Roman" w:cs="Times New Roman"/>
-          <w:b/>
-          <w:bCs/>
-          <w:color w:val="FF0000"/>
-          <w:sz w:val="24"/>
-          <w:szCs w:val="24"/>
-        </w:rPr>
-        <w:t>Version History</w:t>
-      </w:r>
-      <w:r>
-        <w:rPr>
-          <w:rFonts w:eastAsia="Times New Roman" w:cs="Times New Roman"/>
-          <w:color w:val="FF0000"/>
-          <w:sz w:val="24"/>
-          <w:szCs w:val="24"/>
-        </w:rPr>
-        <w:t xml:space="preserve"> to view or restore previous versions.</w:t>
-      </w:r>
-    </w:p>
-    <w:p>
-      <w:pPr>
-        <w:spacing w:before="100" w:beforeAutospacing="1" w:after="100" w:afterAutospacing="1" w:line="240" w:lineRule="auto"/>
-        <w:ind w:left="720"/>
-        <w:outlineLvl w:val="3"/>
-        <w:rPr>
-          <w:rFonts w:eastAsia="Times New Roman" w:cs="Times New Roman"/>
-          <w:b/>
-          <w:bCs/>
-          <w:color w:val="FF0000"/>
-          <w:sz w:val="24"/>
-          <w:szCs w:val="24"/>
-        </w:rPr>
-      </w:pPr>
-      <w:r>
-        <w:rPr>
-          <w:rFonts w:eastAsia="Times New Roman" w:cs="Times New Roman"/>
-          <w:b/>
-          <w:bCs/>
-          <w:color w:val="FF0000"/>
-          <w:sz w:val="24"/>
-          <w:szCs w:val="24"/>
-        </w:rPr>
-        <w:lastRenderedPageBreak/>
-        <w:t xml:space="preserve">3. </w:t>
-      </w:r>
-      <w:r>
-        <w:rPr>
-          <w:rFonts w:eastAsia="Times New Roman" w:cs="Times New Roman"/>
-          <w:b/>
-          <w:bCs/>
-          <w:color w:val="FF0000"/>
-          <w:sz w:val="24"/>
-          <w:szCs w:val="24"/>
-        </w:rPr>
-        <w:t>Saving files manually</w:t>
-      </w:r>
-      <w:r>
-        <w:rPr>
-          <w:rFonts w:eastAsia="Times New Roman" w:cs="Times New Roman"/>
-          <w:b/>
-          <w:bCs/>
-          <w:color w:val="FF0000"/>
-          <w:sz w:val="24"/>
-          <w:szCs w:val="24"/>
-        </w:rPr>
-        <w:t>:</w:t>
-      </w:r>
-    </w:p>
-    <w:p>
-      <w:pPr>
-        <w:numPr>
-          <w:ilvl w:val="0"/>
-          <w:numId w:val="18"/>
-        </w:numPr>
-        <w:tabs>
-          <w:tab w:val="clear" w:pos="720"/>
-          <w:tab w:val="num" w:pos="1440"/>
-        </w:tabs>
-        <w:spacing w:before="100" w:beforeAutospacing="1" w:after="100" w:afterAutospacing="1" w:line="240" w:lineRule="auto"/>
-        <w:ind w:left="1440"/>
-        <w:rPr>
-          <w:rFonts w:eastAsia="Times New Roman" w:cs="Times New Roman"/>
-          <w:color w:val="FF0000"/>
-          <w:sz w:val="24"/>
-          <w:szCs w:val="24"/>
-        </w:rPr>
-      </w:pPr>
-      <w:r>
-        <w:rPr>
-          <w:rFonts w:eastAsia="Times New Roman" w:cs="Times New Roman"/>
-          <w:color w:val="FF0000"/>
-          <w:sz w:val="24"/>
-          <w:szCs w:val="24"/>
-        </w:rPr>
-        <w:t xml:space="preserve">Users can create manual versions by saving files with date or version numbers in the filename, like </w:t>
-      </w:r>
-      <w:r>
-        <w:rPr>
-          <w:rFonts w:eastAsia="Times New Roman" w:cs="Courier New"/>
-          <w:color w:val="FF0000"/>
-          <w:sz w:val="24"/>
-          <w:szCs w:val="24"/>
-        </w:rPr>
-        <w:t>Document_v1</w:t>
-      </w:r>
-      <w:r>
-        <w:rPr>
-          <w:rFonts w:eastAsia="Times New Roman" w:cs="Times New Roman"/>
-          <w:color w:val="FF0000"/>
-          <w:sz w:val="24"/>
-          <w:szCs w:val="24"/>
-        </w:rPr>
-        <w:t xml:space="preserve">, </w:t>
-      </w:r>
-      <w:r>
-        <w:rPr>
-          <w:rFonts w:eastAsia="Times New Roman" w:cs="Courier New"/>
-          <w:color w:val="FF0000"/>
-          <w:sz w:val="24"/>
-          <w:szCs w:val="24"/>
-        </w:rPr>
-        <w:t>Document_v2</w:t>
-      </w:r>
-      <w:r>
-        <w:rPr>
-          <w:rFonts w:eastAsia="Times New Roman" w:cs="Times New Roman"/>
-          <w:color w:val="FF0000"/>
-          <w:sz w:val="24"/>
-          <w:szCs w:val="24"/>
-        </w:rPr>
-        <w:t>, etc.</w:t>
-      </w:r>
-    </w:p>
-    <w:p>
-      <w:pPr>
-        <w:numPr>
-          <w:ilvl w:val="0"/>
-          <w:numId w:val="18"/>
-        </w:numPr>
-        <w:tabs>
-          <w:tab w:val="clear" w:pos="720"/>
-          <w:tab w:val="num" w:pos="1440"/>
-        </w:tabs>
-        <w:spacing w:before="100" w:beforeAutospacing="1" w:after="100" w:afterAutospacing="1" w:line="240" w:lineRule="auto"/>
-        <w:ind w:left="1440"/>
-        <w:rPr>
-          <w:rFonts w:eastAsia="Times New Roman" w:cs="Times New Roman"/>
-          <w:color w:val="FF0000"/>
-          <w:sz w:val="24"/>
-          <w:szCs w:val="24"/>
-        </w:rPr>
-      </w:pPr>
-      <w:r>
-        <w:rPr>
-          <w:rFonts w:eastAsia="Times New Roman" w:cs="Times New Roman"/>
-          <w:color w:val="FF0000"/>
-          <w:sz w:val="24"/>
-          <w:szCs w:val="24"/>
-        </w:rPr>
-        <w:t>This method requires consistent discipline and a well-maintained naming system.</w:t>
-      </w:r>
-    </w:p>
-    <w:p>
-      <w:pPr>
-        <w:spacing w:before="100" w:beforeAutospacing="1" w:after="100" w:afterAutospacing="1" w:line="240" w:lineRule="auto"/>
-        <w:ind w:left="1080"/>
-        <w:rPr>
-          <w:rFonts w:eastAsia="Times New Roman" w:cs="Times New Roman"/>
-          <w:color w:val="FF0000"/>
-          <w:sz w:val="24"/>
-          <w:szCs w:val="24"/>
-        </w:rPr>
-      </w:pPr>
-      <w:r>
-        <w:rPr>
-          <w:rFonts w:eastAsia="Times New Roman" w:cs="Times New Roman"/>
-          <w:color w:val="FF0000"/>
-          <w:sz w:val="24"/>
-          <w:szCs w:val="24"/>
-        </w:rPr>
-        <w:t>Proper file naming is critical for version control. To efficiently track different versions of a document, file names should include essential details such as:</w:t>
-      </w:r>
-    </w:p>
-    <w:p>
-      <w:pPr>
-        <w:numPr>
-          <w:ilvl w:val="0"/>
-          <w:numId w:val="19"/>
-        </w:numPr>
-        <w:tabs>
-          <w:tab w:val="clear" w:pos="720"/>
-          <w:tab w:val="num" w:pos="1800"/>
-        </w:tabs>
-        <w:spacing w:before="100" w:beforeAutospacing="1" w:after="100" w:afterAutospacing="1" w:line="240" w:lineRule="auto"/>
-        <w:ind w:left="1800"/>
-        <w:rPr>
-          <w:rFonts w:eastAsia="Times New Roman" w:cs="Times New Roman"/>
-          <w:color w:val="FF0000"/>
-          <w:sz w:val="24"/>
-          <w:szCs w:val="24"/>
-        </w:rPr>
-      </w:pPr>
-      <w:r>
-        <w:rPr>
-          <w:rFonts w:eastAsia="Times New Roman" w:cs="Times New Roman"/>
-          <w:b/>
-          <w:bCs/>
-          <w:color w:val="FF0000"/>
-          <w:sz w:val="24"/>
-          <w:szCs w:val="24"/>
-        </w:rPr>
-        <w:t>Student number</w:t>
-      </w:r>
-    </w:p>
-    <w:p>
-      <w:pPr>
-        <w:numPr>
-          <w:ilvl w:val="0"/>
-          <w:numId w:val="19"/>
-        </w:numPr>
-        <w:tabs>
-          <w:tab w:val="clear" w:pos="720"/>
-          <w:tab w:val="num" w:pos="1800"/>
-        </w:tabs>
-        <w:spacing w:before="100" w:beforeAutospacing="1" w:after="100" w:afterAutospacing="1" w:line="240" w:lineRule="auto"/>
-        <w:ind w:left="1800"/>
-        <w:rPr>
-          <w:rFonts w:eastAsia="Times New Roman" w:cs="Times New Roman"/>
-          <w:color w:val="FF0000"/>
-          <w:sz w:val="24"/>
-          <w:szCs w:val="24"/>
-        </w:rPr>
-      </w:pPr>
-      <w:r>
-        <w:rPr>
-          <w:rFonts w:eastAsia="Times New Roman" w:cs="Times New Roman"/>
-          <w:b/>
-          <w:bCs/>
-          <w:color w:val="FF0000"/>
-          <w:sz w:val="24"/>
-          <w:szCs w:val="24"/>
-        </w:rPr>
-        <w:t xml:space="preserve">Assignment </w:t>
-      </w:r>
-    </w:p>
-    <w:p>
-      <w:pPr>
-        <w:numPr>
-          <w:ilvl w:val="0"/>
-          <w:numId w:val="19"/>
-        </w:numPr>
-        <w:tabs>
-          <w:tab w:val="clear" w:pos="720"/>
-          <w:tab w:val="num" w:pos="1800"/>
-        </w:tabs>
-        <w:spacing w:before="100" w:beforeAutospacing="1" w:after="100" w:afterAutospacing="1" w:line="240" w:lineRule="auto"/>
-        <w:ind w:left="1800"/>
-        <w:rPr>
-          <w:rFonts w:eastAsia="Times New Roman" w:cs="Times New Roman"/>
-          <w:color w:val="FF0000"/>
-          <w:sz w:val="24"/>
-          <w:szCs w:val="24"/>
-        </w:rPr>
-      </w:pPr>
-      <w:r>
-        <w:rPr>
-          <w:rFonts w:eastAsia="Times New Roman" w:cs="Times New Roman"/>
-          <w:b/>
-          <w:bCs/>
-          <w:color w:val="FF0000"/>
-          <w:sz w:val="24"/>
-          <w:szCs w:val="24"/>
-        </w:rPr>
-        <w:t>Module title</w:t>
-      </w:r>
-    </w:p>
-    <w:p>
-      <w:pPr>
-        <w:numPr>
-          <w:ilvl w:val="0"/>
-          <w:numId w:val="19"/>
-        </w:numPr>
-        <w:tabs>
-          <w:tab w:val="clear" w:pos="720"/>
-          <w:tab w:val="num" w:pos="1800"/>
-        </w:tabs>
-        <w:spacing w:before="100" w:beforeAutospacing="1" w:after="100" w:afterAutospacing="1" w:line="240" w:lineRule="auto"/>
-        <w:ind w:left="1800"/>
-        <w:rPr>
-          <w:rFonts w:eastAsia="Times New Roman" w:cs="Times New Roman"/>
-          <w:color w:val="FF0000"/>
-          <w:sz w:val="24"/>
-          <w:szCs w:val="24"/>
-        </w:rPr>
-      </w:pPr>
-      <w:r>
-        <w:rPr>
-          <w:rFonts w:eastAsia="Times New Roman" w:cs="Times New Roman"/>
-          <w:b/>
-          <w:bCs/>
-          <w:color w:val="FF0000"/>
-          <w:sz w:val="24"/>
-          <w:szCs w:val="24"/>
-        </w:rPr>
-        <w:t>Version Number</w:t>
-      </w:r>
-    </w:p>
-    <w:p>
-      <w:pPr>
-        <w:spacing w:before="100" w:beforeAutospacing="1" w:after="100" w:afterAutospacing="1" w:line="240" w:lineRule="auto"/>
-        <w:ind w:left="1440"/>
-        <w:rPr>
-          <w:rFonts w:eastAsia="Times New Roman" w:cs="Times New Roman"/>
-          <w:color w:val="FF0000"/>
-          <w:sz w:val="24"/>
-          <w:szCs w:val="24"/>
-        </w:rPr>
-      </w:pPr>
-      <w:r>
-        <w:rPr>
-          <w:rFonts w:eastAsia="Times New Roman" w:cs="Times New Roman"/>
-          <w:b/>
-          <w:bCs/>
-          <w:color w:val="FF0000"/>
-          <w:sz w:val="24"/>
-          <w:szCs w:val="24"/>
-        </w:rPr>
-        <w:t>For example: 2024998_CA1_</w:t>
-      </w:r>
-      <w:r>
-        <w:t xml:space="preserve"> </w:t>
-      </w:r>
-      <w:r>
-        <w:rPr>
-          <w:rFonts w:eastAsia="Times New Roman" w:cs="Times New Roman"/>
-          <w:b/>
-          <w:bCs/>
-          <w:color w:val="FF0000"/>
-          <w:sz w:val="24"/>
-          <w:szCs w:val="24"/>
-        </w:rPr>
-        <w:t>Data Visualisation &amp; Communication</w:t>
-      </w:r>
-      <w:r>
-        <w:rPr>
-          <w:rFonts w:eastAsia="Times New Roman" w:cs="Times New Roman"/>
-          <w:b/>
-          <w:bCs/>
-          <w:color w:val="FF0000"/>
-          <w:sz w:val="24"/>
-          <w:szCs w:val="24"/>
-        </w:rPr>
-        <w:t>_v1</w:t>
-      </w:r>
-    </w:p>
-    <w:p>
-      <w:pPr>
-        <w:spacing w:before="100" w:beforeAutospacing="1" w:after="100" w:afterAutospacing="1" w:line="240" w:lineRule="auto"/>
-        <w:ind w:left="1080"/>
-        <w:rPr>
-          <w:rFonts w:eastAsia="Times New Roman" w:cs="Times New Roman"/>
-          <w:color w:val="FF0000"/>
-          <w:sz w:val="24"/>
-          <w:szCs w:val="24"/>
-        </w:rPr>
-      </w:pPr>
-      <w:r>
-        <w:rPr>
-          <w:rFonts w:eastAsia="Times New Roman" w:cs="Times New Roman"/>
-          <w:color w:val="FF0000"/>
-          <w:sz w:val="24"/>
-          <w:szCs w:val="24"/>
-        </w:rPr>
-        <w:t>By adhering to a consistent file-naming convention, it's easier to identify and retrieve specific versions of a file, avoid confusion, and ensure efficient collaboration across multiple contributor</w:t>
-      </w:r>
-      <w:r>
-        <w:rPr>
-          <w:rFonts w:eastAsia="Times New Roman" w:cs="Times New Roman"/>
-          <w:color w:val="FF0000"/>
-          <w:sz w:val="24"/>
-          <w:szCs w:val="24"/>
-        </w:rPr>
-        <w:t>s.</w:t>
-      </w:r>
-    </w:p>
-    <w:p>
-      <w:pPr>
-        <w:spacing w:after="0" w:line="240" w:lineRule="auto"/>
-        <w:rPr>
-          <w:rFonts w:ascii="Times New Roman" w:eastAsia="Times New Roman" w:hAnsi="Times New Roman" w:cs="Times New Roman"/>
-          <w:sz w:val="24"/>
-          <w:szCs w:val="24"/>
-        </w:rPr>
-      </w:pPr>
-    </w:p>
-    <w:p>
-      <w:pPr>
-        <w:spacing w:line="240" w:lineRule="auto"/>
-        <w:rPr>
-          <w:rFonts w:ascii="Times New Roman" w:eastAsia="Times New Roman" w:hAnsi="Times New Roman" w:cs="Times New Roman"/>
-          <w:sz w:val="24"/>
-          <w:szCs w:val="24"/>
-        </w:rPr>
-      </w:pPr>
-      <w:r>
-        <w:rPr>
-          <w:rFonts w:ascii="Aptos" w:eastAsia="Times New Roman" w:hAnsi="Aptos" w:cs="Times New Roman"/>
-          <w:b/>
-          <w:bCs/>
-          <w:color w:val="FF0000"/>
-          <w:sz w:val="24"/>
-          <w:szCs w:val="24"/>
-          <w:u w:val="single"/>
-        </w:rPr>
-        <w:t>Ensure that any content written in red is removed from the document before submission.</w:t>
-      </w:r>
-    </w:p>
-    <w:p>
-      <w:pPr>
-        <w:rPr>
-          <w:color w:val="FF0000"/>
-          <w:sz w:val="32"/>
-          <w:szCs w:val="32"/>
-        </w:rPr>
-      </w:pPr>
-    </w:p>
-    <w:p>
-      <w:pPr>
-        <w:rPr>
-          <w:color w:val="FF0000"/>
-          <w:sz w:val="32"/>
-          <w:szCs w:val="32"/>
-        </w:rPr>
-      </w:pPr>
-    </w:p>
-    <w:p>
-      <w:pPr>
-        <w:rPr>
-          <w:color w:val="FF0000"/>
-          <w:sz w:val="32"/>
-          <w:szCs w:val="32"/>
-        </w:rPr>
-      </w:pPr>
-    </w:p>
-    <w:p>
-      <w:pPr>
-        <w:rPr>
-          <w:rFonts w:ascii="Aptos" w:eastAsia="Aptos" w:hAnsi="Aptos" w:cs="Aptos"/>
-          <w:b/>
-          <w:color w:val="FF0000"/>
-          <w:sz w:val="24"/>
-          <w:szCs w:val="24"/>
-          <w:u w:val="single"/>
-        </w:rPr>
-      </w:pPr>
-    </w:p>
-    <w:p>
-      <w:pPr>
-        <w:rPr>
-          <w:rFonts w:ascii="Aptos" w:eastAsia="Aptos" w:hAnsi="Aptos" w:cs="Aptos"/>
-          <w:b/>
-          <w:color w:val="FF0000"/>
-          <w:sz w:val="24"/>
-          <w:szCs w:val="24"/>
-          <w:u w:val="single"/>
-        </w:rPr>
-      </w:pPr>
-    </w:p>
-    <w:p>
-      <w:pPr>
-        <w:rPr>
-          <w:rFonts w:ascii="Aptos" w:eastAsia="Aptos" w:hAnsi="Aptos" w:cs="Aptos"/>
-          <w:b/>
-          <w:color w:val="FF0000"/>
-          <w:sz w:val="24"/>
-          <w:szCs w:val="24"/>
-          <w:u w:val="single"/>
-        </w:rPr>
-      </w:pPr>
-    </w:p>
-    <w:p>
-      <w:pPr>
-        <w:rPr>
-          <w:rFonts w:ascii="Aptos" w:eastAsia="Aptos" w:hAnsi="Aptos" w:cs="Aptos"/>
-          <w:b/>
-          <w:color w:val="FF0000"/>
-          <w:sz w:val="24"/>
-          <w:szCs w:val="24"/>
-          <w:u w:val="single"/>
-        </w:rPr>
-      </w:pPr>
-    </w:p>
-    <w:p>
-      <w:pPr>
-        <w:rPr>
-          <w:color w:val="FF0000"/>
-          <w:sz w:val="32"/>
-          <w:szCs w:val="32"/>
-        </w:rPr>
-      </w:pPr>
-    </w:p>
-    <w:p>
-      <w:pPr>
-        <w:rPr>
-          <w:color w:val="FF0000"/>
-          <w:sz w:val="32"/>
-          <w:szCs w:val="32"/>
-        </w:rPr>
-      </w:pPr>
-    </w:p>
-    <w:p>
-      <w:pPr>
-        <w:rPr>
-          <w:color w:val="FF0000"/>
-          <w:sz w:val="32"/>
-          <w:szCs w:val="32"/>
-        </w:rPr>
-      </w:pPr>
-    </w:p>
-    <w:p>
-      <w:pPr>
-        <w:rPr>
-          <w:color w:val="FF0000"/>
-          <w:sz w:val="32"/>
-          <w:szCs w:val="32"/>
-        </w:rPr>
-      </w:pPr>
-    </w:p>
-    <w:p>
-      <w:pPr>
-        <w:rPr>
-          <w:color w:val="FF0000"/>
-          <w:sz w:val="32"/>
-          <w:szCs w:val="32"/>
-        </w:rPr>
-      </w:pPr>
-    </w:p>
-    <w:p>
-      <w:pPr>
-        <w:rPr>
-          <w:color w:val="3A3A3A"/>
-          <w:sz w:val="40"/>
-          <w:szCs w:val="40"/>
-        </w:rPr>
-      </w:pPr>
-      <w:r>
-        <w:rPr>
-          <w:color w:val="3A3A3A"/>
-          <w:sz w:val="40"/>
-          <w:szCs w:val="40"/>
-        </w:rPr>
-        <w:lastRenderedPageBreak/>
-        <w:t>Abstract</w:t>
-      </w:r>
-    </w:p>
-    <w:p/>
-    <w:p>
-      <w:pPr>
-        <w:rPr>
-          <w:color w:val="FF0000"/>
-        </w:rPr>
-      </w:pPr>
-      <w:r>
-        <w:rPr>
-          <w:color w:val="FF0000"/>
-        </w:rPr>
-        <w:t xml:space="preserve">[NOTE: This section is designated for the abstract. Abstracts are not assigned page numbers and should precede the table of contents. If an abstract is unnecessary for your work, please delete this page.] </w:t>
-      </w:r>
-    </w:p>
-    <w:p>
-      <w:pPr>
-        <w:rPr>
-          <w:color w:val="FF0000"/>
-        </w:rPr>
-      </w:pPr>
-    </w:p>
-    <w:p>
-      <w:pPr>
-        <w:rPr>
-          <w:color w:val="FF0000"/>
-        </w:rPr>
-      </w:pPr>
-    </w:p>
-    <w:p>
-      <w:pPr>
-        <w:rPr>
-          <w:color w:val="FF0000"/>
-        </w:rPr>
-      </w:pPr>
-    </w:p>
-    <w:p/>
-    <w:p/>
-    <w:p/>
-    <w:p/>
-    <w:p/>
-    <w:p/>
-    <w:p/>
-    <w:p/>
-    <w:p/>
-    <w:p/>
-    <w:p/>
-    <w:p/>
-    <w:p/>
-    <w:p/>
-    <w:p/>
-    <w:p/>
-    <w:p/>
-    <w:p/>
-    <w:p/>
-    <w:p/>
-    <w:p/>
-    <w:p/>
-    <w:p>
-      <w:pPr>
-        <w:keepNext/>
-        <w:keepLines/>
-        <w:pBdr>
-          <w:top w:val="nil"/>
-          <w:left w:val="nil"/>
-          <w:bottom w:val="nil"/>
-          <w:right w:val="nil"/>
-          <w:between w:val="nil"/>
-        </w:pBdr>
-        <w:spacing w:before="240" w:after="0" w:line="240" w:lineRule="auto"/>
-        <w:rPr>
-          <w:rFonts w:ascii="Play" w:eastAsia="Play" w:hAnsi="Play" w:cs="Play"/>
-          <w:color w:val="0F4761"/>
-          <w:sz w:val="32"/>
-          <w:szCs w:val="32"/>
-        </w:rPr>
-      </w:pPr>
-      <w:r>
-        <w:rPr>
-          <w:rFonts w:ascii="Play" w:eastAsia="Play" w:hAnsi="Play" w:cs="Play"/>
-          <w:color w:val="0F4761"/>
-          <w:sz w:val="32"/>
-          <w:szCs w:val="32"/>
-        </w:rPr>
-        <w:lastRenderedPageBreak/>
-        <w:t>Contents</w:t>
-      </w:r>
-    </w:p>
-    <w:sdt>
-      <w:sdtPr>
-        <w:id w:val="-1939593324"/>
-        <w:docPartObj>
-          <w:docPartGallery w:val="Table of Contents"/>
-          <w:docPartUnique/>
-        </w:docPartObj>
-      </w:sdtPr>
-      <w:sdtContent>
-        <w:p>
-          <w:pPr>
-            <w:pBdr>
-              <w:top w:val="nil"/>
-              <w:left w:val="nil"/>
-              <w:bottom w:val="nil"/>
-              <w:right w:val="nil"/>
-              <w:between w:val="nil"/>
-            </w:pBdr>
-            <w:tabs>
-              <w:tab w:val="right" w:leader="dot" w:pos="9016"/>
-            </w:tabs>
-            <w:spacing w:after="100"/>
-            <w:rPr>
-              <w:rFonts w:ascii="Aptos" w:eastAsia="Aptos" w:hAnsi="Aptos" w:cs="Aptos"/>
-              <w:color w:val="000000"/>
-              <w:sz w:val="24"/>
-              <w:szCs w:val="24"/>
-            </w:rPr>
-          </w:pPr>
-          <w:r>
-            <w:fldChar w:fldCharType="begin"/>
-          </w:r>
-          <w:r>
-            <w:instrText xml:space="preserve"> TOC \h \u \z \t "Heading 1,1,Heading 2,2,Heading 3,3,"</w:instrText>
-          </w:r>
-          <w:r>
-            <w:fldChar w:fldCharType="separate"/>
-          </w:r>
-          <w:hyperlink w:anchor="_heading=h.gjdgxs">
-            <w:r>
-              <w:rPr>
-                <w:color w:val="000000"/>
-              </w:rPr>
-              <w:t>Introduction</w:t>
-            </w:r>
-            <w:r>
-              <w:rPr>
-                <w:color w:val="000000"/>
-              </w:rPr>
-              <w:tab/>
-              <w:t>1</w:t>
-            </w:r>
-          </w:hyperlink>
-        </w:p>
-        <w:p>
-          <w:pPr>
-            <w:pBdr>
-              <w:top w:val="nil"/>
-              <w:left w:val="nil"/>
-              <w:bottom w:val="nil"/>
-              <w:right w:val="nil"/>
-              <w:between w:val="nil"/>
-            </w:pBdr>
-            <w:tabs>
-              <w:tab w:val="right" w:leader="dot" w:pos="9016"/>
-            </w:tabs>
-            <w:spacing w:after="100"/>
-            <w:rPr>
-              <w:rFonts w:ascii="Aptos" w:eastAsia="Aptos" w:hAnsi="Aptos" w:cs="Aptos"/>
-              <w:color w:val="000000"/>
-              <w:sz w:val="24"/>
-              <w:szCs w:val="24"/>
-            </w:rPr>
-          </w:pPr>
-          <w:hyperlink w:anchor="_heading=h.30j0zll">
-            <w:r>
-              <w:rPr>
-                <w:color w:val="000000"/>
-              </w:rPr>
-              <w:t>Chapter 1</w:t>
-            </w:r>
-            <w:r>
-              <w:rPr>
-                <w:color w:val="000000"/>
-              </w:rPr>
-              <w:tab/>
-              <w:t>1</w:t>
-            </w:r>
-          </w:hyperlink>
-        </w:p>
-        <w:p>
-          <w:pPr>
-            <w:pBdr>
-              <w:top w:val="nil"/>
-              <w:left w:val="nil"/>
-              <w:bottom w:val="nil"/>
-              <w:right w:val="nil"/>
-              <w:between w:val="nil"/>
-            </w:pBdr>
-            <w:tabs>
-              <w:tab w:val="right" w:leader="dot" w:pos="9016"/>
-            </w:tabs>
-            <w:spacing w:after="100"/>
-            <w:ind w:left="220"/>
-            <w:rPr>
-              <w:rFonts w:ascii="Aptos" w:eastAsia="Aptos" w:hAnsi="Aptos" w:cs="Aptos"/>
-              <w:color w:val="000000"/>
-              <w:sz w:val="24"/>
-              <w:szCs w:val="24"/>
-            </w:rPr>
-          </w:pPr>
-          <w:hyperlink w:anchor="_heading=h.1fob9te">
-            <w:r>
-              <w:rPr>
-                <w:color w:val="000000"/>
-              </w:rPr>
-              <w:t>Chapter 1.1</w:t>
-            </w:r>
-            <w:r>
-              <w:rPr>
-                <w:color w:val="000000"/>
-              </w:rPr>
-              <w:tab/>
-              <w:t>1</w:t>
-            </w:r>
-          </w:hyperlink>
-        </w:p>
-        <w:p>
-          <w:pPr>
-            <w:pBdr>
-              <w:top w:val="nil"/>
-              <w:left w:val="nil"/>
-              <w:bottom w:val="nil"/>
-              <w:right w:val="nil"/>
-              <w:between w:val="nil"/>
-            </w:pBdr>
-            <w:tabs>
-              <w:tab w:val="right" w:leader="dot" w:pos="9016"/>
-            </w:tabs>
-            <w:spacing w:after="100"/>
-            <w:ind w:left="440"/>
-            <w:rPr>
-              <w:rFonts w:ascii="Aptos" w:eastAsia="Aptos" w:hAnsi="Aptos" w:cs="Aptos"/>
-              <w:color w:val="000000"/>
-              <w:sz w:val="24"/>
-              <w:szCs w:val="24"/>
-            </w:rPr>
-          </w:pPr>
-          <w:hyperlink w:anchor="_heading=h.3znysh7">
-            <w:r>
-              <w:rPr>
-                <w:color w:val="000000"/>
-              </w:rPr>
-              <w:t>Chapter 1.1.1.</w:t>
-            </w:r>
-            <w:r>
-              <w:rPr>
-                <w:color w:val="000000"/>
-              </w:rPr>
-              <w:tab/>
-              <w:t>1</w:t>
-            </w:r>
-          </w:hyperlink>
-        </w:p>
-        <w:p>
-          <w:pPr>
-            <w:pBdr>
-              <w:top w:val="nil"/>
-              <w:left w:val="nil"/>
-              <w:bottom w:val="nil"/>
-              <w:right w:val="nil"/>
-              <w:between w:val="nil"/>
-            </w:pBdr>
-            <w:tabs>
-              <w:tab w:val="right" w:leader="dot" w:pos="9016"/>
-            </w:tabs>
-            <w:spacing w:after="100"/>
-            <w:rPr>
-              <w:rFonts w:ascii="Aptos" w:eastAsia="Aptos" w:hAnsi="Aptos" w:cs="Aptos"/>
-              <w:color w:val="000000"/>
-              <w:sz w:val="24"/>
-              <w:szCs w:val="24"/>
-            </w:rPr>
-          </w:pPr>
-          <w:hyperlink w:anchor="_heading=h.2et92p0">
-            <w:r>
-              <w:rPr>
-                <w:color w:val="000000"/>
-              </w:rPr>
-              <w:t>References</w:t>
-            </w:r>
-            <w:r>
-              <w:rPr>
-                <w:color w:val="000000"/>
-              </w:rPr>
-              <w:tab/>
-              <w:t>2</w:t>
-            </w:r>
-          </w:hyperlink>
-        </w:p>
-        <w:p>
-          <w:r>
-            <w:fldChar w:fldCharType="end"/>
-          </w:r>
-        </w:p>
-      </w:sdtContent>
-    </w:sdt>
-    <w:p/>
-    <w:p>
-      <w:pPr>
-        <w:rPr>
-          <w:color w:val="FF0000"/>
-        </w:rPr>
-      </w:pPr>
-      <w:r>
-        <w:rPr>
-          <w:color w:val="FF0000"/>
-        </w:rPr>
-        <w:t>[NOTE: The table of contents above has been included for your convenience. To refresh the table, simply click on it, then select 'Update Table' using the mouse. You can choose to update either the page numbers exclusively or the entire table as needed.]</w:t>
-      </w:r>
-    </w:p>
-    <w:p/>
-    <w:p/>
-    <w:p>
-      <w:pPr>
-        <w:sectPr>
-          <w:footerReference w:type="default" r:id="rId8"/>
-          <w:pgSz w:w="11906" w:h="16838"/>
-          <w:pgMar w:top="1440" w:right="1440" w:bottom="1440" w:left="1440" w:header="708" w:footer="708" w:gutter="0"/>
-          <w:cols w:space="720"/>
-        </w:sectPr>
-      </w:pPr>
-    </w:p>
-    <w:p>
-      <w:pPr>
-        <w:pStyle w:val="Heading1"/>
-        <w:spacing w:after="0"/>
-      </w:pPr>
-      <w:bookmarkStart w:id="0" w:name="_heading=h.gjdgxs" w:colFirst="0" w:colLast="0"/>
-      <w:bookmarkEnd w:id="0"/>
-      <w:r>
-        <w:lastRenderedPageBreak/>
-        <w:t>Introduction</w:t>
-      </w:r>
-    </w:p>
-    <w:p>
-      <w:pPr>
-        <w:pStyle w:val="Heading1"/>
-        <w:spacing w:before="0"/>
-      </w:pPr>
-      <w:bookmarkStart w:id="1" w:name="_heading=h.30j0zll" w:colFirst="0" w:colLast="0"/>
-      <w:bookmarkEnd w:id="1"/>
-      <w:r>
-        <w:t>Chapter 1</w:t>
-      </w:r>
-    </w:p>
-    <w:p>
-      <w:pPr>
-        <w:pStyle w:val="Heading2"/>
-      </w:pPr>
-      <w:bookmarkStart w:id="2" w:name="_heading=h.1fob9te" w:colFirst="0" w:colLast="0"/>
-      <w:bookmarkEnd w:id="2"/>
-      <w:r>
-        <w:t>Chapter 1.1</w:t>
-      </w:r>
-    </w:p>
-    <w:p>
-      <w:pPr>
-        <w:pStyle w:val="Heading3"/>
-      </w:pPr>
-      <w:bookmarkStart w:id="3" w:name="_heading=h.3znysh7" w:colFirst="0" w:colLast="0"/>
-      <w:bookmarkEnd w:id="3"/>
-      <w:r>
-        <w:t>Chapter 1.1.1.</w:t>
-      </w:r>
-    </w:p>
-    <w:p/>
-    <w:p>
-      <w:r>
-        <w:rPr>
-          <w:noProof/>
         </w:rPr>
         <w:drawing>
-          <wp:inline distT="0" distB="0" distL="0" distR="0" wp14:anchorId="669EB2F4" wp14:editId="714439A4">
-            <wp:extent cx="3571875" cy="819150"/>
-            <wp:effectExtent l="0" t="0" r="0" b="0"/>
-            <wp:docPr id="1728545884" name="image2.png" descr="A screenshot of a computer&#10;&#10;Description automatically generated"/>
-            <wp:cNvGraphicFramePr/>
+          <wp:inline distT="0" distB="0" distL="0" distR="0" wp14:anchorId="4BB16C22" wp14:editId="708E2772">
+            <wp:extent cx="5731510" cy="2677795"/>
+            <wp:effectExtent l="0" t="0" r="2540" b="8255"/>
+            <wp:docPr id="1844558034" name="Picture 1"/>
+            <wp:cNvGraphicFramePr>
+              <a:graphicFrameLocks xmlns:a="http://schemas.openxmlformats.org/drawingml/2006/main" noChangeAspect="1"/>
+            </wp:cNvGraphicFramePr>
             <a:graphic xmlns:a="http://schemas.openxmlformats.org/drawingml/2006/main">
               <a:graphicData uri="http://schemas.openxmlformats.org/drawingml/2006/picture">
                 <pic:pic xmlns:pic="http://schemas.openxmlformats.org/drawingml/2006/picture">
                   <pic:nvPicPr>
-                    <pic:cNvPr id="0" name="image2.png" descr="A screenshot of a computer&#10;&#10;Description automatically generated"/>
-                    <pic:cNvPicPr preferRelativeResize="0"/>
+                    <pic:cNvPr id="1844558034" name=""/>
+                    <pic:cNvPicPr/>
                   </pic:nvPicPr>
                   <pic:blipFill>
-                    <a:blip r:embed="rId9"/>
-                    <a:srcRect/>
+                    <a:blip r:embed="rId10"/>
                     <a:stretch>
                       <a:fillRect/>
                     </a:stretch>
@@ -3295,12 +1675,11 @@
                   <pic:spPr>
                     <a:xfrm>
                       <a:off x="0" y="0"/>
-                      <a:ext cx="3571875" cy="819150"/>
+                      <a:ext cx="5731510" cy="2677795"/>
                     </a:xfrm>
                     <a:prstGeom prst="rect">
                       <a:avLst/>
                     </a:prstGeom>
-                    <a:ln/>
                   </pic:spPr>
                 </pic:pic>
               </a:graphicData>
@@ -3309,300 +1688,63 @@
         </w:drawing>
       </w:r>
     </w:p>
-    <w:p>
-      <w:pPr>
-        <w:rPr>
-          <w:color w:val="FF0000"/>
-        </w:rPr>
-      </w:pPr>
-    </w:p>
-    <w:p>
-      <w:pPr>
-        <w:rPr>
-          <w:color w:val="FF0000"/>
-        </w:rPr>
-      </w:pPr>
-      <w:r>
-        <w:rPr>
-          <w:color w:val="FF0000"/>
-        </w:rPr>
-        <w:t>[NOTE: For the table of contents to function properly, you must use the correct headings for all your chapters and subchapters.</w:t>
-      </w:r>
-    </w:p>
-    <w:p>
-      <w:pPr>
-        <w:rPr>
-          <w:color w:val="FF0000"/>
-        </w:rPr>
-      </w:pPr>
-      <w:r>
-        <w:rPr>
-          <w:b/>
-          <w:color w:val="FF0000"/>
-        </w:rPr>
-        <w:t>Heading 1:</w:t>
-      </w:r>
-      <w:r>
-        <w:rPr>
-          <w:color w:val="FF0000"/>
-        </w:rPr>
-        <w:t xml:space="preserve"> This is the main heading and should be employed for the primary title or chapter. For example: CHAPTER 1.</w:t>
-      </w:r>
-    </w:p>
-    <w:p>
-      <w:pPr>
-        <w:rPr>
-          <w:color w:val="FF0000"/>
-        </w:rPr>
-      </w:pPr>
-      <w:r>
-        <w:rPr>
-          <w:b/>
-          <w:color w:val="FF0000"/>
-        </w:rPr>
-        <w:t>Heading 2:</w:t>
-      </w:r>
-      <w:r>
-        <w:rPr>
-          <w:color w:val="FF0000"/>
-        </w:rPr>
-        <w:t xml:space="preserve"> Use Heading 2 as a subheading. For instance: Chapter 1.1.</w:t>
-      </w:r>
-    </w:p>
-    <w:p>
-      <w:pPr>
-        <w:rPr>
-          <w:color w:val="FF0000"/>
-        </w:rPr>
-      </w:pPr>
-      <w:r>
-        <w:rPr>
-          <w:b/>
-          <w:color w:val="FF0000"/>
-        </w:rPr>
-        <w:t>Heading 3:</w:t>
-      </w:r>
-      <w:r>
-        <w:rPr>
-          <w:color w:val="FF0000"/>
-        </w:rPr>
-        <w:t xml:space="preserve"> Heading 3 provides a more detailed breakdown, such as Chapter 1.1.1.</w:t>
-      </w:r>
-    </w:p>
-    <w:p>
-      <w:pPr>
-        <w:rPr>
-          <w:color w:val="FF0000"/>
-        </w:rPr>
-      </w:pPr>
-      <w:r>
-        <w:rPr>
-          <w:color w:val="FF0000"/>
-        </w:rPr>
-        <w:t>By adhering to this hierarchical structure, you ensure an organized and effective document outline, enhancing readability and navigation. However, you are not forced to use all 3 headings, usually heading 1 and 2 are sufficient.</w:t>
-      </w:r>
-    </w:p>
-    <w:p>
-      <w:pPr>
-        <w:rPr>
-          <w:color w:val="FF0000"/>
-        </w:rPr>
-      </w:pPr>
-      <w:r>
-        <w:rPr>
-          <w:color w:val="FF0000"/>
-        </w:rPr>
-        <w:t>The remainder of your text should be written using a normal font.]</w:t>
-      </w:r>
-    </w:p>
-    <w:p/>
-    <w:p/>
-    <w:p/>
-    <w:p/>
-    <w:p/>
-    <w:p/>
-    <w:p/>
-    <w:p/>
-    <w:p/>
-    <w:p/>
-    <w:p/>
-    <w:p/>
-    <w:p>
-      <w:pPr>
-        <w:pStyle w:val="Heading1"/>
-      </w:pPr>
-      <w:bookmarkStart w:id="4" w:name="_heading=h.2et92p0" w:colFirst="0" w:colLast="0"/>
-      <w:bookmarkEnd w:id="4"/>
-      <w:r>
-        <w:lastRenderedPageBreak/>
-        <w:t>References</w:t>
-      </w:r>
-    </w:p>
-    <w:p/>
-    <w:p>
-      <w:pPr>
-        <w:rPr>
-          <w:color w:val="FF0000"/>
-        </w:rPr>
-      </w:pPr>
-      <w:r>
-        <w:rPr>
-          <w:color w:val="FF0000"/>
-        </w:rPr>
-        <w:t>Please list all the references you have used in your assignment alphabetically and in the Harvard style. You can find information on how to correctly reference in Harvard at this link: https://library.cct.ie/referencing/harvard</w:t>
-      </w:r>
-    </w:p>
-    <w:p/>
-    <w:p/>
-    <w:p/>
-    <w:p/>
-    <w:p/>
-    <w:p/>
-    <w:p/>
-    <w:p/>
-    <w:p/>
-    <w:p/>
-    <w:p/>
-    <w:p/>
-    <w:p/>
-    <w:p/>
-    <w:p/>
-    <w:p/>
-    <w:p/>
-    <w:p>
-      <w:pPr>
-        <w:pBdr>
-          <w:top w:val="nil"/>
-          <w:left w:val="nil"/>
-          <w:bottom w:val="nil"/>
-          <w:right w:val="nil"/>
-          <w:between w:val="nil"/>
-        </w:pBdr>
-        <w:spacing w:after="0" w:line="240" w:lineRule="auto"/>
-        <w:rPr>
-          <w:color w:val="000000"/>
-        </w:rPr>
-      </w:pPr>
-    </w:p>
-    <w:p/>
-    <w:p/>
-    <w:p/>
-    <w:p/>
-    <w:p/>
-    <w:p/>
-    <w:p/>
-    <w:p/>
-    <w:p/>
-    <w:p/>
-    <w:p>
-      <w:pPr>
-        <w:pStyle w:val="Heading1"/>
-      </w:pPr>
-      <w:bookmarkStart w:id="5" w:name="_heading=h.kfkjs3rwl2c1" w:colFirst="0" w:colLast="0"/>
-      <w:bookmarkEnd w:id="5"/>
-      <w:r>
-        <w:t>Appendix</w:t>
-      </w:r>
-    </w:p>
-    <w:p/>
-    <w:p>
-      <w:pPr>
-        <w:rPr>
-          <w:color w:val="FF0000"/>
-        </w:rPr>
-      </w:pPr>
-    </w:p>
-    <w:p>
-      <w:pPr>
-        <w:rPr>
-          <w:color w:val="FF0000"/>
-        </w:rPr>
-      </w:pPr>
-      <w:r>
-        <w:rPr>
-          <w:color w:val="FF0000"/>
-        </w:rPr>
-        <w:t xml:space="preserve">If you have used AI tools in your work, you must include screenshots of your requests in the appendix. </w:t>
-      </w:r>
-    </w:p>
-    <w:p>
-      <w:pPr>
-        <w:rPr>
-          <w:color w:val="FF0000"/>
-        </w:rPr>
-      </w:pPr>
-      <w:r>
-        <w:rPr>
-          <w:color w:val="FF0000"/>
-        </w:rPr>
-        <w:t>The appendix serves as a repository for additional or supplementary information that is deemed too extensive or detailed for integration into the main body of the text. This supplementary content can encompass data tables, charts, graphs, questionnaires, or any other supporting materials that contribute to a comprehensive understanding of the research.</w:t>
-      </w:r>
-    </w:p>
-    <w:p>
-      <w:pPr>
-        <w:rPr>
-          <w:color w:val="FF0000"/>
-        </w:rPr>
-      </w:pPr>
-      <w:r>
-        <w:rPr>
-          <w:color w:val="FF0000"/>
-        </w:rPr>
-        <w:t>If you haven't used AI tools and there's no need for supplementary data, you can remove the appendix section entirely.</w:t>
-      </w:r>
-    </w:p>
     <w:sectPr>
       <w:pgSz w:w="11906" w:h="16838"/>
       <w:pgMar w:top="1440" w:right="1440" w:bottom="1440" w:left="1440" w:header="708" w:footer="708" w:gutter="0"/>
-      <w:cols w:space="708"/>
-      <w:docGrid w:linePitch="360"/>
+      <w:cols w:space="720"/>
     </w:sectPr>
   </w:body>
 </w:document>
 </file>
 
-<file path=word/footer1.xml><?xml version="1.0" encoding="utf-8"?>
-<w:ftr xmlns:wpc="http://schemas.microsoft.com/office/word/2010/wordprocessingCanvas" xmlns:cx="http://schemas.microsoft.com/office/drawing/2014/chartex" xmlns:cx1="http://schemas.microsoft.com/office/drawing/2015/9/8/chartex" xmlns:cx2="http://schemas.microsoft.com/office/drawing/2015/10/21/chartex" xmlns:cx3="http://schemas.microsoft.com/office/drawing/2016/5/9/chartex" xmlns:cx4="http://schemas.microsoft.com/office/drawing/2016/5/10/chartex" xmlns:cx5="http://schemas.microsoft.com/office/drawing/2016/5/11/chartex" xmlns:cx6="http://schemas.microsoft.com/office/drawing/2016/5/12/chartex" xmlns:cx7="http://schemas.microsoft.com/office/drawing/2016/5/13/chartex" xmlns:cx8="http://schemas.microsoft.com/office/drawing/2016/5/14/chartex" xmlns:mc="http://schemas.openxmlformats.org/markup-compatibility/2006" xmlns:aink="http://schemas.microsoft.com/office/drawing/2016/ink" xmlns:am3d="http://schemas.microsoft.com/office/drawing/2017/model3d" xmlns:o="urn:schemas-microsoft-com:office:office" xmlns:oel="http://schemas.microsoft.com/office/2019/extlst" xmlns:r="http://schemas.openxmlformats.org/officeDocument/2006/relationships" xmlns:m="http://schemas.openxmlformats.org/officeDocument/2006/math" xmlns:v="urn:schemas-microsoft-com:vml" xmlns:wp14="http://schemas.microsoft.com/office/word/2010/wordprocessingDrawing" xmlns:wp="http://schemas.openxmlformats.org/drawingml/2006/wordprocessingDrawing" xmlns:w10="urn:schemas-microsoft-com:office:word" xmlns:w="http://schemas.openxmlformats.org/wordprocessingml/2006/main" xmlns:w14="http://schemas.microsoft.com/office/word/2010/wordml" xmlns:w15="http://schemas.microsoft.com/office/word/2012/wordml" xmlns:w16cex="http://schemas.microsoft.com/office/word/2018/wordml/cex" xmlns:w16cid="http://schemas.microsoft.com/office/word/2016/wordml/cid" xmlns:w16="http://schemas.microsoft.com/office/word/2018/wordml" xmlns:w16du="http://schemas.microsoft.com/office/word/2023/wordml/word16du" xmlns:w16sdtdh="http://schemas.microsoft.com/office/word/2020/wordml/sdtdatahash" xmlns:w16sdtfl="http://schemas.microsoft.com/office/word/2024/wordml/sdtformatlock" xmlns:w16se="http://schemas.microsoft.com/office/word/2015/wordml/symex" xmlns:wpg="http://schemas.microsoft.com/office/word/2010/wordprocessingGroup" xmlns:wpi="http://schemas.microsoft.com/office/word/2010/wordprocessingInk" xmlns:wne="http://schemas.microsoft.com/office/word/2006/wordml" xmlns:wps="http://schemas.microsoft.com/office/word/2010/wordprocessingShape" mc:Ignorable="w14 w15 w16se w16cid w16 w16cex w16sdtdh w16sdtfl w16du wp14">
-  <w:p>
-    <w:pPr>
-      <w:pBdr>
-        <w:top w:val="nil"/>
-        <w:left w:val="nil"/>
-        <w:bottom w:val="nil"/>
-        <w:right w:val="nil"/>
-        <w:between w:val="nil"/>
-      </w:pBdr>
-      <w:tabs>
-        <w:tab w:val="center" w:pos="4513"/>
-        <w:tab w:val="right" w:pos="9026"/>
-      </w:tabs>
-      <w:spacing w:after="0" w:line="240" w:lineRule="auto"/>
-      <w:jc w:val="center"/>
-      <w:rPr>
-        <w:color w:val="000000"/>
-      </w:rPr>
-    </w:pPr>
-  </w:p>
-  <w:p>
-    <w:pPr>
-      <w:pBdr>
-        <w:top w:val="nil"/>
-        <w:left w:val="nil"/>
-        <w:bottom w:val="nil"/>
-        <w:right w:val="nil"/>
-        <w:between w:val="nil"/>
-      </w:pBdr>
-      <w:tabs>
-        <w:tab w:val="center" w:pos="4513"/>
-        <w:tab w:val="right" w:pos="9026"/>
-      </w:tabs>
-      <w:spacing w:after="0" w:line="240" w:lineRule="auto"/>
-      <w:rPr>
-        <w:color w:val="000000"/>
-      </w:rPr>
-    </w:pPr>
-  </w:p>
-</w:ftr>
+<file path=word/endnotes.xml><?xml version="1.0" encoding="utf-8"?>
+<w:endnotes xmlns:wpc="http://schemas.microsoft.com/office/word/2010/wordprocessingCanvas" xmlns:cx="http://schemas.microsoft.com/office/drawing/2014/chartex" xmlns:cx1="http://schemas.microsoft.com/office/drawing/2015/9/8/chartex" xmlns:cx2="http://schemas.microsoft.com/office/drawing/2015/10/21/chartex" xmlns:cx3="http://schemas.microsoft.com/office/drawing/2016/5/9/chartex" xmlns:cx4="http://schemas.microsoft.com/office/drawing/2016/5/10/chartex" xmlns:cx5="http://schemas.microsoft.com/office/drawing/2016/5/11/chartex" xmlns:cx6="http://schemas.microsoft.com/office/drawing/2016/5/12/chartex" xmlns:cx7="http://schemas.microsoft.com/office/drawing/2016/5/13/chartex" xmlns:cx8="http://schemas.microsoft.com/office/drawing/2016/5/14/chartex" xmlns:mc="http://schemas.openxmlformats.org/markup-compatibility/2006" xmlns:aink="http://schemas.microsoft.com/office/drawing/2016/ink" xmlns:am3d="http://schemas.microsoft.com/office/drawing/2017/model3d" xmlns:o="urn:schemas-microsoft-com:office:office" xmlns:oel="http://schemas.microsoft.com/office/2019/extlst" xmlns:r="http://schemas.openxmlformats.org/officeDocument/2006/relationships" xmlns:m="http://schemas.openxmlformats.org/officeDocument/2006/math" xmlns:v="urn:schemas-microsoft-com:vml" xmlns:wp14="http://schemas.microsoft.com/office/word/2010/wordprocessingDrawing" xmlns:wp="http://schemas.openxmlformats.org/drawingml/2006/wordprocessingDrawing" xmlns:w10="urn:schemas-microsoft-com:office:word" xmlns:w="http://schemas.openxmlformats.org/wordprocessingml/2006/main" xmlns:w14="http://schemas.microsoft.com/office/word/2010/wordml" xmlns:w15="http://schemas.microsoft.com/office/word/2012/wordml" xmlns:w16cex="http://schemas.microsoft.com/office/word/2018/wordml/cex" xmlns:w16cid="http://schemas.microsoft.com/office/word/2016/wordml/cid" xmlns:w16="http://schemas.microsoft.com/office/word/2018/wordml" xmlns:w16du="http://schemas.microsoft.com/office/word/2023/wordml/word16du" xmlns:w16sdtdh="http://schemas.microsoft.com/office/word/2020/wordml/sdtdatahash" xmlns:w16sdtfl="http://schemas.microsoft.com/office/word/2024/wordml/sdtformatlock" xmlns:w16se="http://schemas.microsoft.com/office/word/2015/wordml/symex" xmlns:wpg="http://schemas.microsoft.com/office/word/2010/wordprocessingGroup" xmlns:wpi="http://schemas.microsoft.com/office/word/2010/wordprocessingInk" xmlns:wne="http://schemas.microsoft.com/office/word/2006/wordml" xmlns:wps="http://schemas.microsoft.com/office/word/2010/wordprocessingShape" mc:Ignorable="w14 w15 w16se w16cid w16 w16cex w16sdtdh w16sdtfl w16du wp14">
+  <w:endnote w:type="separator" w:id="-1">
+    <w:p>
+      <w:pPr>
+        <w:spacing w:after="0" w:line="240" w:lineRule="auto"/>
+      </w:pPr>
+      <w:r>
+        <w:separator/>
+      </w:r>
+    </w:p>
+  </w:endnote>
+  <w:endnote w:type="continuationSeparator" w:id="0">
+    <w:p>
+      <w:pPr>
+        <w:spacing w:after="0" w:line="240" w:lineRule="auto"/>
+      </w:pPr>
+      <w:r>
+        <w:continuationSeparator/>
+      </w:r>
+    </w:p>
+  </w:endnote>
+</w:endnotes>
+</file>
+
+<file path=word/footnotes.xml><?xml version="1.0" encoding="utf-8"?>
+<w:footnotes xmlns:wpc="http://schemas.microsoft.com/office/word/2010/wordprocessingCanvas" xmlns:cx="http://schemas.microsoft.com/office/drawing/2014/chartex" xmlns:cx1="http://schemas.microsoft.com/office/drawing/2015/9/8/chartex" xmlns:cx2="http://schemas.microsoft.com/office/drawing/2015/10/21/chartex" xmlns:cx3="http://schemas.microsoft.com/office/drawing/2016/5/9/chartex" xmlns:cx4="http://schemas.microsoft.com/office/drawing/2016/5/10/chartex" xmlns:cx5="http://schemas.microsoft.com/office/drawing/2016/5/11/chartex" xmlns:cx6="http://schemas.microsoft.com/office/drawing/2016/5/12/chartex" xmlns:cx7="http://schemas.microsoft.com/office/drawing/2016/5/13/chartex" xmlns:cx8="http://schemas.microsoft.com/office/drawing/2016/5/14/chartex" xmlns:mc="http://schemas.openxmlformats.org/markup-compatibility/2006" xmlns:aink="http://schemas.microsoft.com/office/drawing/2016/ink" xmlns:am3d="http://schemas.microsoft.com/office/drawing/2017/model3d" xmlns:o="urn:schemas-microsoft-com:office:office" xmlns:oel="http://schemas.microsoft.com/office/2019/extlst" xmlns:r="http://schemas.openxmlformats.org/officeDocument/2006/relationships" xmlns:m="http://schemas.openxmlformats.org/officeDocument/2006/math" xmlns:v="urn:schemas-microsoft-com:vml" xmlns:wp14="http://schemas.microsoft.com/office/word/2010/wordprocessingDrawing" xmlns:wp="http://schemas.openxmlformats.org/drawingml/2006/wordprocessingDrawing" xmlns:w10="urn:schemas-microsoft-com:office:word" xmlns:w="http://schemas.openxmlformats.org/wordprocessingml/2006/main" xmlns:w14="http://schemas.microsoft.com/office/word/2010/wordml" xmlns:w15="http://schemas.microsoft.com/office/word/2012/wordml" xmlns:w16cex="http://schemas.microsoft.com/office/word/2018/wordml/cex" xmlns:w16cid="http://schemas.microsoft.com/office/word/2016/wordml/cid" xmlns:w16="http://schemas.microsoft.com/office/word/2018/wordml" xmlns:w16du="http://schemas.microsoft.com/office/word/2023/wordml/word16du" xmlns:w16sdtdh="http://schemas.microsoft.com/office/word/2020/wordml/sdtdatahash" xmlns:w16sdtfl="http://schemas.microsoft.com/office/word/2024/wordml/sdtformatlock" xmlns:w16se="http://schemas.microsoft.com/office/word/2015/wordml/symex" xmlns:wpg="http://schemas.microsoft.com/office/word/2010/wordprocessingGroup" xmlns:wpi="http://schemas.microsoft.com/office/word/2010/wordprocessingInk" xmlns:wne="http://schemas.microsoft.com/office/word/2006/wordml" xmlns:wps="http://schemas.microsoft.com/office/word/2010/wordprocessingShape" mc:Ignorable="w14 w15 w16se w16cid w16 w16cex w16sdtdh w16sdtfl w16du wp14">
+  <w:footnote w:type="separator" w:id="-1">
+    <w:p>
+      <w:pPr>
+        <w:spacing w:after="0" w:line="240" w:lineRule="auto"/>
+      </w:pPr>
+      <w:r>
+        <w:separator/>
+      </w:r>
+    </w:p>
+  </w:footnote>
+  <w:footnote w:type="continuationSeparator" w:id="0">
+    <w:p>
+      <w:pPr>
+        <w:spacing w:after="0" w:line="240" w:lineRule="auto"/>
+      </w:pPr>
+      <w:r>
+        <w:continuationSeparator/>
+      </w:r>
+    </w:p>
+  </w:footnote>
+</w:footnotes>
 </file>
 
 <file path=word/numbering.xml><?xml version="1.0" encoding="utf-8"?>
@@ -6731,7 +4873,6 @@
   <w:style w:type="character" w:default="1" w:styleId="DefaultParagraphFont">
     <w:name w:val="Default Paragraph Font"/>
     <w:uiPriority w:val="1"/>
-    <w:semiHidden/>
     <w:unhideWhenUsed/>
   </w:style>
   <w:style w:type="table" w:default="1" w:styleId="TableNormal">

</xml_diff>